<commit_message>
docs: guion actualizado con segmento 4b (status + rmdir -r) y nuevo Word
</commit_message>
<xml_diff>
--- a/Guion_Video_Demo.docx
+++ b/Guion_Video_Demo.docx
@@ -2,94 +2,58 @@
 <file path=word/document.xml><?xml version="1.0" encoding="utf-8"?>
 <w:document xmlns:wpc="http://schemas.microsoft.com/office/word/2010/wordprocessingCanvas" xmlns:mo="http://schemas.microsoft.com/office/mac/office/2008/main" xmlns:mc="http://schemas.openxmlformats.org/markup-compatibility/2006" xmlns:mv="urn:schemas-microsoft-com:mac:vml" xmlns:o="urn:schemas-microsoft-com:office:office" xmlns:r="http://schemas.openxmlformats.org/officeDocument/2006/relationships" xmlns:m="http://schemas.openxmlformats.org/officeDocument/2006/math" xmlns:v="urn:schemas-microsoft-com:vml" xmlns:wp14="http://schemas.microsoft.com/office/word/2010/wordprocessingDrawing" xmlns:wp="http://schemas.openxmlformats.org/drawingml/2006/wordprocessingDrawing" xmlns:w10="urn:schemas-microsoft-com:office:word" xmlns:w="http://schemas.openxmlformats.org/wordprocessingml/2006/main" xmlns:w14="http://schemas.microsoft.com/office/word/2010/wordml" xmlns:wpg="http://schemas.microsoft.com/office/word/2010/wordprocessingGroup" xmlns:wpi="http://schemas.microsoft.com/office/word/2010/wordprocessingInk" xmlns:wne="http://schemas.microsoft.com/office/word/2006/wordml" xmlns:wps="http://schemas.microsoft.com/office/word/2010/wordprocessingShape" mc:Ignorable="w14 wp14">
   <w:body>
-    <w:p/>
-    <w:p/>
     <w:p>
       <w:pPr>
-        <w:jc w:val="center"/>
-      </w:pPr>
-      <w:r>
-        <w:rPr>
-          <w:b/>
-          <w:color w:val="1E3A8A"/>
-          <w:sz w:val="44"/>
-        </w:rPr>
-        <w:t>GUION – VIDEO DEMOSTRACION</w:t>
-      </w:r>
-    </w:p>
-    <w:p>
-      <w:pPr>
-        <w:jc w:val="center"/>
-      </w:pPr>
-      <w:r>
-        <w:rPr>
-          <w:b/>
-          <w:color w:val="0F766E"/>
-          <w:sz w:val="30"/>
-        </w:rPr>
-        <w:t>MiniDFS – Sistema de Archivos Distribuidos por Bloques</w:t>
-      </w:r>
-    </w:p>
-    <w:p/>
-    <w:p>
-      <w:pPr>
-        <w:jc w:val="center"/>
-      </w:pPr>
-      <w:r>
-        <w:rPr>
-          <w:sz w:val="24"/>
-        </w:rPr>
-        <w:t>Presentador: Andres Felipe Nunez Hernandez</w:t>
-      </w:r>
-    </w:p>
-    <w:p>
-      <w:pPr>
-        <w:jc w:val="center"/>
-      </w:pPr>
-      <w:r>
-        <w:rPr>
-          <w:sz w:val="24"/>
-        </w:rPr>
-        <w:t>Arquitecturas de Nube y Sistemas Distribuidos – UPB 2026</w:t>
-      </w:r>
-    </w:p>
-    <w:p>
-      <w:pPr>
-        <w:jc w:val="center"/>
-      </w:pPr>
-      <w:r>
-        <w:rPr>
-          <w:sz w:val="12"/>
-        </w:rPr>
-      </w:r>
-    </w:p>
-    <w:p>
-      <w:pPr>
-        <w:jc w:val="center"/>
-      </w:pPr>
-      <w:r>
-        <w:rPr>
-          <w:sz w:val="22"/>
-        </w:rPr>
-        <w:t>Duracion objetivo: 12 a 15 minutos</w:t>
-      </w:r>
-    </w:p>
-    <w:p>
-      <w:r>
-        <w:br w:type="page"/>
-      </w:r>
-    </w:p>
-    <w:p>
-      <w:pPr>
         <w:pStyle w:val="Heading1"/>
-        <w:jc w:val="left"/>
       </w:pPr>
       <w:r>
         <w:rPr>
           <w:color w:val="1E3A8A"/>
         </w:rPr>
-        <w:t>Estructura General</w:t>
+        <w:t>🎬 Guión – Video Demostración MiniDFS</w:t>
       </w:r>
+    </w:p>
+    <w:p>
+      <w:pPr>
+        <w:pStyle w:val="Heading2"/>
+      </w:pPr>
+      <w:r>
+        <w:rPr>
+          <w:color w:val="0F766E"/>
+        </w:rPr>
+        <w:t>Duración objetivo: 12–15 minutos | Solo presentador: Andrés Núñez</w:t>
+      </w:r>
+    </w:p>
+    <w:p>
+      <w:pPr>
+        <w:spacing w:after="40"/>
+      </w:pPr>
+    </w:p>
+    <w:p>
+      <w:pPr>
+        <w:spacing w:after="40"/>
+      </w:pPr>
+    </w:p>
+    <w:p>
+      <w:pPr>
+        <w:spacing w:after="40"/>
+      </w:pPr>
+    </w:p>
+    <w:p>
+      <w:pPr>
+        <w:pStyle w:val="Heading2"/>
+      </w:pPr>
+      <w:r>
+        <w:rPr>
+          <w:color w:val="0F766E"/>
+        </w:rPr>
+        <w:t>📋 ESTRUCTURA GENERAL</w:t>
+      </w:r>
+    </w:p>
+    <w:p>
+      <w:pPr>
+        <w:spacing w:after="40"/>
+      </w:pPr>
     </w:p>
     <w:tbl>
       <w:tblPr>
@@ -98,21 +62,19 @@
         <w:tblLook w:firstColumn="1" w:firstRow="1" w:lastColumn="0" w:lastRow="0" w:noHBand="0" w:noVBand="1" w:val="04A0"/>
       </w:tblPr>
       <w:tblGrid>
-        <w:gridCol w:w="3041"/>
-        <w:gridCol w:w="3041"/>
-        <w:gridCol w:w="3041"/>
+        <w:gridCol w:w="3135"/>
+        <w:gridCol w:w="3135"/>
+        <w:gridCol w:w="3135"/>
       </w:tblGrid>
       <w:tr>
         <w:tc>
           <w:tcPr>
-            <w:tcW w:type="dxa" w:w="3041"/>
-            <w:shd w:val="clear" w:color="auto" w:fill="1E3A8A"/>
+            <w:tcW w:type="dxa" w:w="3135"/>
           </w:tcPr>
           <w:p>
             <w:r>
               <w:rPr>
                 <w:b/>
-                <w:color w:val="FFFFFF"/>
               </w:rPr>
               <w:t>Segmento</w:t>
             </w:r>
@@ -120,14 +82,12 @@
         </w:tc>
         <w:tc>
           <w:tcPr>
-            <w:tcW w:type="dxa" w:w="3041"/>
-            <w:shd w:val="clear" w:color="auto" w:fill="1E3A8A"/>
+            <w:tcW w:type="dxa" w:w="3135"/>
           </w:tcPr>
           <w:p>
             <w:r>
               <w:rPr>
                 <w:b/>
-                <w:color w:val="FFFFFF"/>
               </w:rPr>
               <w:t>Tema</w:t>
             </w:r>
@@ -135,14 +95,12 @@
         </w:tc>
         <w:tc>
           <w:tcPr>
-            <w:tcW w:type="dxa" w:w="3041"/>
-            <w:shd w:val="clear" w:color="auto" w:fill="1E3A8A"/>
+            <w:tcW w:type="dxa" w:w="3135"/>
           </w:tcPr>
           <w:p>
             <w:r>
               <w:rPr>
                 <w:b/>
-                <w:color w:val="FFFFFF"/>
               </w:rPr>
               <w:t>Tiempo</w:t>
             </w:r>
@@ -152,7 +110,7 @@
       <w:tr>
         <w:tc>
           <w:tcPr>
-            <w:tcW w:type="dxa" w:w="3041"/>
+            <w:tcW w:type="dxa" w:w="3135"/>
           </w:tcPr>
           <w:p>
             <w:r>
@@ -162,17 +120,17 @@
         </w:tc>
         <w:tc>
           <w:tcPr>
-            <w:tcW w:type="dxa" w:w="3041"/>
+            <w:tcW w:type="dxa" w:w="3135"/>
           </w:tcPr>
           <w:p>
             <w:r>
-              <w:t>Introduccion y presentacion</w:t>
+              <w:t>Introducción y presentación</w:t>
             </w:r>
           </w:p>
         </w:tc>
         <w:tc>
           <w:tcPr>
-            <w:tcW w:type="dxa" w:w="3041"/>
+            <w:tcW w:type="dxa" w:w="3135"/>
           </w:tcPr>
           <w:p>
             <w:r>
@@ -184,7 +142,7 @@
       <w:tr>
         <w:tc>
           <w:tcPr>
-            <w:tcW w:type="dxa" w:w="3041"/>
+            <w:tcW w:type="dxa" w:w="3135"/>
           </w:tcPr>
           <w:p>
             <w:r>
@@ -194,7 +152,7 @@
         </w:tc>
         <w:tc>
           <w:tcPr>
-            <w:tcW w:type="dxa" w:w="3041"/>
+            <w:tcW w:type="dxa" w:w="3135"/>
           </w:tcPr>
           <w:p>
             <w:r>
@@ -204,7 +162,7 @@
         </w:tc>
         <w:tc>
           <w:tcPr>
-            <w:tcW w:type="dxa" w:w="3041"/>
+            <w:tcW w:type="dxa" w:w="3135"/>
           </w:tcPr>
           <w:p>
             <w:r>
@@ -216,7 +174,7 @@
       <w:tr>
         <w:tc>
           <w:tcPr>
-            <w:tcW w:type="dxa" w:w="3041"/>
+            <w:tcW w:type="dxa" w:w="3135"/>
           </w:tcPr>
           <w:p>
             <w:r>
@@ -226,17 +184,17 @@
         </w:tc>
         <w:tc>
           <w:tcPr>
-            <w:tcW w:type="dxa" w:w="3041"/>
+            <w:tcW w:type="dxa" w:w="3135"/>
           </w:tcPr>
           <w:p>
             <w:r>
-              <w:t>Recorrido por el codigo</w:t>
+              <w:t>Recorrido por el código</w:t>
             </w:r>
           </w:p>
         </w:tc>
         <w:tc>
           <w:tcPr>
-            <w:tcW w:type="dxa" w:w="3041"/>
+            <w:tcW w:type="dxa" w:w="3135"/>
           </w:tcPr>
           <w:p>
             <w:r>
@@ -248,7 +206,7 @@
       <w:tr>
         <w:tc>
           <w:tcPr>
-            <w:tcW w:type="dxa" w:w="3041"/>
+            <w:tcW w:type="dxa" w:w="3135"/>
           </w:tcPr>
           <w:p>
             <w:r>
@@ -258,17 +216,17 @@
         </w:tc>
         <w:tc>
           <w:tcPr>
-            <w:tcW w:type="dxa" w:w="3041"/>
+            <w:tcW w:type="dxa" w:w="3135"/>
           </w:tcPr>
           <w:p>
             <w:r>
-              <w:t>Demo en vivo – AWS EC2</w:t>
+              <w:t>Demo en vivo – AWS EC2 (put, get, sha256)</w:t>
             </w:r>
           </w:p>
         </w:tc>
         <w:tc>
           <w:tcPr>
-            <w:tcW w:type="dxa" w:w="3041"/>
+            <w:tcW w:type="dxa" w:w="3135"/>
           </w:tcPr>
           <w:p>
             <w:r>
@@ -280,27 +238,27 @@
       <w:tr>
         <w:tc>
           <w:tcPr>
-            <w:tcW w:type="dxa" w:w="3041"/>
+            <w:tcW w:type="dxa" w:w="3135"/>
           </w:tcPr>
           <w:p>
             <w:r>
-              <w:t>5</w:t>
+              <w:t>4b</w:t>
             </w:r>
           </w:p>
         </w:tc>
         <w:tc>
           <w:tcPr>
-            <w:tcW w:type="dxa" w:w="3041"/>
+            <w:tcW w:type="dxa" w:w="3135"/>
           </w:tcPr>
           <w:p>
             <w:r>
-              <w:t>Tolerancia a fallos</w:t>
+              <w:t>Demo nuevas funciones (status, rmdir -r)</w:t>
             </w:r>
           </w:p>
         </w:tc>
         <w:tc>
           <w:tcPr>
-            <w:tcW w:type="dxa" w:w="3041"/>
+            <w:tcW w:type="dxa" w:w="3135"/>
           </w:tcPr>
           <w:p>
             <w:r>
@@ -312,7 +270,39 @@
       <w:tr>
         <w:tc>
           <w:tcPr>
-            <w:tcW w:type="dxa" w:w="3041"/>
+            <w:tcW w:type="dxa" w:w="3135"/>
+          </w:tcPr>
+          <w:p>
+            <w:r>
+              <w:t>5</w:t>
+            </w:r>
+          </w:p>
+        </w:tc>
+        <w:tc>
+          <w:tcPr>
+            <w:tcW w:type="dxa" w:w="3135"/>
+          </w:tcPr>
+          <w:p>
+            <w:r>
+              <w:t>Tolerancia a fallos</w:t>
+            </w:r>
+          </w:p>
+        </w:tc>
+        <w:tc>
+          <w:tcPr>
+            <w:tcW w:type="dxa" w:w="3135"/>
+          </w:tcPr>
+          <w:p>
+            <w:r>
+              <w:t>2 min</w:t>
+            </w:r>
+          </w:p>
+        </w:tc>
+      </w:tr>
+      <w:tr>
+        <w:tc>
+          <w:tcPr>
+            <w:tcW w:type="dxa" w:w="3135"/>
           </w:tcPr>
           <w:p>
             <w:r>
@@ -322,7 +312,7 @@
         </w:tc>
         <w:tc>
           <w:tcPr>
-            <w:tcW w:type="dxa" w:w="3041"/>
+            <w:tcW w:type="dxa" w:w="3135"/>
           </w:tcPr>
           <w:p>
             <w:r>
@@ -332,7 +322,7 @@
         </w:tc>
         <w:tc>
           <w:tcPr>
-            <w:tcW w:type="dxa" w:w="3041"/>
+            <w:tcW w:type="dxa" w:w="3135"/>
           </w:tcPr>
           <w:p>
             <w:r>
@@ -341,649 +331,840 @@
           </w:p>
         </w:tc>
       </w:tr>
-      <w:tr>
-        <w:tc>
-          <w:tcPr>
-            <w:tcW w:type="dxa" w:w="3041"/>
-            <w:shd w:val="clear" w:color="auto" w:fill="0F766E"/>
-          </w:tcPr>
-          <w:p>
-            <w:r>
-              <w:rPr>
-                <w:b/>
-                <w:color w:val="FFFFFF"/>
-              </w:rPr>
-              <w:t>TOTAL</w:t>
-            </w:r>
-          </w:p>
-        </w:tc>
-        <w:tc>
-          <w:tcPr>
-            <w:tcW w:type="dxa" w:w="3041"/>
-            <w:shd w:val="clear" w:color="auto" w:fill="0F766E"/>
-          </w:tcPr>
-          <w:p>
-            <w:r>
-              <w:rPr>
-                <w:b/>
-                <w:color w:val="FFFFFF"/>
-              </w:rPr>
-            </w:r>
-          </w:p>
-        </w:tc>
-        <w:tc>
-          <w:tcPr>
-            <w:tcW w:type="dxa" w:w="3041"/>
-            <w:shd w:val="clear" w:color="auto" w:fill="0F766E"/>
-          </w:tcPr>
-          <w:p>
-            <w:r>
-              <w:rPr>
-                <w:b/>
-                <w:color w:val="FFFFFF"/>
-              </w:rPr>
-              <w:t>~14 min</w:t>
-            </w:r>
-          </w:p>
-        </w:tc>
-      </w:tr>
     </w:tbl>
     <w:p/>
     <w:p>
       <w:pPr>
-        <w:spacing w:after="100"/>
+        <w:spacing w:after="40"/>
+      </w:pPr>
+    </w:p>
+    <w:p>
+      <w:pPr>
+        <w:spacing w:after="40"/>
+      </w:pPr>
+    </w:p>
+    <w:p>
+      <w:pPr>
+        <w:spacing w:after="40"/>
+      </w:pPr>
+    </w:p>
+    <w:p>
+      <w:pPr>
+        <w:pStyle w:val="Heading2"/>
+      </w:pPr>
+      <w:r>
+        <w:rPr>
+          <w:color w:val="0F766E"/>
+        </w:rPr>
+        <w:t>🎙️ GUIÓN COMPLETO</w:t>
+      </w:r>
+    </w:p>
+    <w:p>
+      <w:pPr>
+        <w:spacing w:after="40"/>
+      </w:pPr>
+    </w:p>
+    <w:p>
+      <w:pPr>
+        <w:spacing w:after="40"/>
+      </w:pPr>
+    </w:p>
+    <w:p>
+      <w:pPr>
+        <w:spacing w:after="40"/>
+      </w:pPr>
+    </w:p>
+    <w:p>
+      <w:pPr>
+        <w:pStyle w:val="Heading3"/>
+      </w:pPr>
+      <w:r>
+        <w:rPr>
+          <w:color w:val="6D28D9"/>
+        </w:rPr>
+        <w:t>SEGMENTO 1 – INTRODUCCIÓN (1 min)</w:t>
+      </w:r>
+    </w:p>
+    <w:p>
+      <w:pPr>
+        <w:spacing w:after="80"/>
+        <w:ind w:left="567"/>
+        <w:shd w:val="clear" w:color="auto" w:fill="EFF6FF"/>
+      </w:pPr>
+      <w:r>
+        <w:rPr>
+          <w:i/>
+          <w:color w:val="1E3A8A"/>
+          <w:sz w:val="21"/>
+        </w:rPr>
+        <w:t>📺 Pantalla: Cámara frontal + diapositiva con el nombre del proyecto</w:t>
+      </w:r>
+    </w:p>
+    <w:p>
+      <w:pPr>
+        <w:spacing w:after="40"/>
+      </w:pPr>
+    </w:p>
+    <w:p>
+      <w:pPr>
+        <w:spacing w:after="80"/>
       </w:pPr>
       <w:r>
         <w:rPr>
           <w:b/>
           <w:i w:val="0"/>
+          <w:color w:val="0F766E"/>
           <w:sz w:val="22"/>
         </w:rPr>
-        <w:t>CONVENCION DE COLORES EN ESTE GUION:</w:t>
+        <w:t>[Hablar mirando a cámara]</w:t>
       </w:r>
     </w:p>
     <w:p>
       <w:pPr>
-        <w:ind w:left="283"/>
+        <w:spacing w:after="40"/>
+      </w:pPr>
+    </w:p>
+    <w:p>
+      <w:pPr>
+        <w:spacing w:after="80"/>
+        <w:ind w:left="567"/>
+        <w:shd w:val="clear" w:color="auto" w:fill="EFF6FF"/>
       </w:pPr>
       <w:r>
         <w:rPr>
-          <w:color w:val="1E40AF"/>
-          <w:sz w:val="20"/>
+          <w:i/>
+          <w:color w:val="1E3A8A"/>
+          <w:sz w:val="21"/>
         </w:rPr>
-        <w:t xml:space="preserve">  Texto en azul cursiva = lo que debes DECIR en camara</w:t>
+        <w:t>"Hola, soy Andrés Núñez, estudiante de Ingeniería de Sistemas de la Universidad Pontificia Bolivariana. En este video voy a presentar MiniDFS, un Sistema de Archivos Distribuidos por Bloques que desarrollé para la materia de Arquitecturas de Nube y Sistemas Distribuidos.</w:t>
       </w:r>
     </w:p>
     <w:p>
       <w:pPr>
-        <w:ind w:left="283"/>
+        <w:spacing w:after="80"/>
       </w:pPr>
       <w:r>
         <w:rPr>
-          <w:color w:val="0F766E"/>
-          <w:sz w:val="20"/>
+          <w:b w:val="0"/>
+          <w:i w:val="0"/>
+          <w:sz w:val="22"/>
         </w:rPr>
-        <w:t xml:space="preserve">  Texto en verde = ACCION a realizar (abrir archivo, ejecutar comando, etc.)</w:t>
+        <w:t>&gt;</w:t>
       </w:r>
     </w:p>
     <w:p>
       <w:pPr>
-        <w:ind w:left="283"/>
+        <w:spacing w:after="80"/>
+        <w:ind w:left="567"/>
+        <w:shd w:val="clear" w:color="auto" w:fill="EFF6FF"/>
       </w:pPr>
       <w:r>
         <w:rPr>
-          <w:color w:val="92400E"/>
-          <w:sz w:val="20"/>
+          <w:i/>
+          <w:color w:val="1E3A8A"/>
+          <w:sz w:val="21"/>
         </w:rPr>
-        <w:t xml:space="preserve">  Texto en naranja = que debe verse en PANTALLA</w:t>
+        <w:t>MiniDFS es una implementación minimalista inspirada en HDFS, el sistema de archivos de Hadoop, y en GFS, el sistema de archivos de Google. El objetivo es almacenar archivos grandes de forma distribuida entre múltiples nodos, con replicación automática y tolerancia a fallos.</w:t>
       </w:r>
     </w:p>
     <w:p>
       <w:pPr>
-        <w:ind w:left="283"/>
+        <w:spacing w:after="80"/>
       </w:pPr>
       <w:r>
         <w:rPr>
-          <w:color w:val="1E40AF"/>
-          <w:sz w:val="20"/>
+          <w:b w:val="0"/>
+          <w:i w:val="0"/>
+          <w:sz w:val="22"/>
         </w:rPr>
-        <w:t xml:space="preserve">  Texto en codigo = COMANDO a ejecutar en la terminal</w:t>
+        <w:t>&gt;</w:t>
       </w:r>
     </w:p>
     <w:p>
+      <w:pPr>
+        <w:spacing w:after="80"/>
+        <w:ind w:left="567"/>
+        <w:shd w:val="clear" w:color="auto" w:fill="EFF6FF"/>
+      </w:pPr>
       <w:r>
-        <w:br w:type="page"/>
+        <w:rPr>
+          <w:i/>
+          <w:color w:val="1E3A8A"/>
+          <w:sz w:val="21"/>
+        </w:rPr>
+        <w:t>Durante esta demostración voy a mostrarles la arquitectura del sistema, el código implementado, y una ejecución en vivo sobre cuatro instancias de AWS EC2 donde el sistema está corriendo en producción."</w:t>
       </w:r>
     </w:p>
     <w:p>
       <w:pPr>
-        <w:pStyle w:val="Heading1"/>
-        <w:jc w:val="left"/>
+        <w:spacing w:after="40"/>
+      </w:pPr>
+    </w:p>
+    <w:p>
+      <w:pPr>
+        <w:spacing w:after="40"/>
+      </w:pPr>
+    </w:p>
+    <w:p>
+      <w:pPr>
+        <w:spacing w:after="40"/>
+      </w:pPr>
+    </w:p>
+    <w:p>
+      <w:pPr>
+        <w:pStyle w:val="Heading3"/>
       </w:pPr>
       <w:r>
         <w:rPr>
-          <w:color w:val="1E3A8A"/>
+          <w:color w:val="6D28D9"/>
         </w:rPr>
-        <w:t>SEGMENTO 1 – Introduccion  (1 minuto)</w:t>
+        <w:t>SEGMENTO 2 – ARQUITECTURA (2 min)</w:t>
       </w:r>
     </w:p>
     <w:p>
       <w:pPr>
-        <w:ind w:left="283"/>
+        <w:spacing w:after="80"/>
+        <w:ind w:left="567"/>
+        <w:shd w:val="clear" w:color="auto" w:fill="EFF6FF"/>
+      </w:pPr>
+      <w:r>
+        <w:rPr>
+          <w:i/>
+          <w:color w:val="1E3A8A"/>
+          <w:sz w:val="21"/>
+        </w:rPr>
+        <w:t>📺 Pantalla: Compartir pantalla → abrir el README.md o el informe Word con los diagramas</w:t>
+      </w:r>
+    </w:p>
+    <w:p>
+      <w:pPr>
+        <w:spacing w:after="40"/>
+      </w:pPr>
+    </w:p>
+    <w:p>
+      <w:pPr>
+        <w:spacing w:after="80"/>
       </w:pPr>
       <w:r>
         <w:rPr>
           <w:b/>
-          <w:color w:val="92400E"/>
-          <w:sz w:val="18"/>
+          <w:i w:val="0"/>
+          <w:color w:val="0F766E"/>
+          <w:sz w:val="22"/>
         </w:rPr>
-        <w:t>Pantalla: Camara frontal + diapositiva con nombre del proyecto</w:t>
+        <w:t>[Señalar el diagrama de arquitectura]</w:t>
       </w:r>
     </w:p>
-    <w:p/>
+    <w:p>
+      <w:pPr>
+        <w:spacing w:after="40"/>
+      </w:pPr>
+    </w:p>
     <w:p>
       <w:pPr>
         <w:spacing w:after="80"/>
         <w:ind w:left="567"/>
+        <w:shd w:val="clear" w:color="auto" w:fill="EFF6FF"/>
       </w:pPr>
       <w:r>
         <w:rPr>
           <w:i/>
-          <w:color w:val="1E40AF"/>
-          <w:sz w:val="22"/>
+          <w:color w:val="1E3A8A"/>
+          <w:sz w:val="21"/>
         </w:rPr>
-        <w:t>"Hola, soy Andres Nunez, estudiante de Ingenieria de Sistemas de la Universidad Pontificia Bolivariana. En este video voy a presentar MiniDFS, un Sistema de Archivos Distribuidos por Bloques que desarrolle para la materia de Arquitecturas de Nube y Sistemas Distribuidos."</w:t>
+        <w:t>"La arquitectura sigue el patrón Maestro–Trabajadores. Tenemos tres componentes principales:</w:t>
       </w:r>
     </w:p>
     <w:p>
       <w:pPr>
         <w:spacing w:after="80"/>
+      </w:pPr>
+      <w:r>
+        <w:rPr>
+          <w:b w:val="0"/>
+          <w:i w:val="0"/>
+          <w:sz w:val="22"/>
+        </w:rPr>
+        <w:t>&gt;</w:t>
+      </w:r>
+    </w:p>
+    <w:p>
+      <w:pPr>
+        <w:spacing w:after="80"/>
         <w:ind w:left="567"/>
+        <w:shd w:val="clear" w:color="auto" w:fill="EFF6FF"/>
       </w:pPr>
       <w:r>
         <w:rPr>
           <w:i/>
-          <w:color w:val="1E40AF"/>
-          <w:sz w:val="22"/>
+          <w:color w:val="1E3A8A"/>
+          <w:sz w:val="21"/>
         </w:rPr>
-        <w:t>"MiniDFS es una implementacion minimalista inspirada en HDFS, el sistema de archivos de Hadoop, y en GFS, el sistema de archivos de Google. El objetivo es almacenar archivos grandes de forma distribuida entre multiples nodos, con replicacion automatica y tolerancia a fallos."</w:t>
+        <w:t>Primero, el NameNode: es el cerebro del sistema. Gestiona todos los metadatos, la autenticación de usuarios con tokens JWT, el espacio de nombres de archivos y coordina dónde se almacena cada bloque. Corre en el puerto 50051.</w:t>
       </w:r>
     </w:p>
     <w:p>
       <w:pPr>
         <w:spacing w:after="80"/>
+      </w:pPr>
+      <w:r>
+        <w:rPr>
+          <w:b w:val="0"/>
+          <w:i w:val="0"/>
+          <w:sz w:val="22"/>
+        </w:rPr>
+        <w:t>&gt;</w:t>
+      </w:r>
+    </w:p>
+    <w:p>
+      <w:pPr>
+        <w:spacing w:after="80"/>
         <w:ind w:left="567"/>
+        <w:shd w:val="clear" w:color="auto" w:fill="EFF6FF"/>
       </w:pPr>
       <w:r>
         <w:rPr>
           <w:i/>
-          <w:color w:val="1E40AF"/>
-          <w:sz w:val="22"/>
+          <w:color w:val="1E3A8A"/>
+          <w:sz w:val="21"/>
         </w:rPr>
-        <w:t>"Durante esta demostracion voy a mostrarles la arquitectura del sistema, el codigo implementado, y una ejecucion en vivo sobre cuatro instancias de AWS EC2 donde el sistema esta corriendo en produccion."</w:t>
+        <w:t>Segundo, los DataNodes: son los trabajadores de almacenamiento. En nuestro caso tenemos tres: dn1, dn2 y dn3, corriendo en los puertos 50061, 50062 y 50063. Cada uno almacena bloques en disco con verificación de integridad SHA-256.</w:t>
       </w:r>
     </w:p>
     <w:p>
+      <w:pPr>
+        <w:spacing w:after="80"/>
+      </w:pPr>
       <w:r>
-        <w:t>______________________________________________________________________</w:t>
+        <w:rPr>
+          <w:b w:val="0"/>
+          <w:i w:val="0"/>
+          <w:sz w:val="22"/>
+        </w:rPr>
+        <w:t>&gt;</w:t>
       </w:r>
     </w:p>
     <w:p>
       <w:pPr>
-        <w:pStyle w:val="Heading1"/>
-        <w:jc w:val="left"/>
+        <w:spacing w:after="80"/>
+        <w:ind w:left="567"/>
+        <w:shd w:val="clear" w:color="auto" w:fill="EFF6FF"/>
       </w:pPr>
       <w:r>
         <w:rPr>
+          <w:i/>
           <w:color w:val="1E3A8A"/>
+          <w:sz w:val="21"/>
         </w:rPr>
-        <w:t>SEGMENTO 2 – Arquitectura del Sistema  (2 minutos)</w:t>
+        <w:t>Tercero, el Cliente: una interfaz de línea de comandos con la que el usuario sube, descarga y gestiona sus archivos.</w:t>
       </w:r>
     </w:p>
     <w:p>
       <w:pPr>
-        <w:ind w:left="283"/>
+        <w:spacing w:after="80"/>
+      </w:pPr>
+      <w:r>
+        <w:rPr>
+          <w:b w:val="0"/>
+          <w:i w:val="0"/>
+          <w:sz w:val="22"/>
+        </w:rPr>
+        <w:t>&gt;</w:t>
+      </w:r>
+    </w:p>
+    <w:p>
+      <w:pPr>
+        <w:spacing w:after="80"/>
+        <w:ind w:left="567"/>
+        <w:shd w:val="clear" w:color="auto" w:fill="EFF6FF"/>
+      </w:pPr>
+      <w:r>
+        <w:rPr>
+          <w:i/>
+          <w:color w:val="1E3A8A"/>
+          <w:sz w:val="21"/>
+        </w:rPr>
+        <w:t>La comunicación entre todos los componentes se hace mediante gRPC con Protocol Buffers, que es mucho más eficiente que REST para transferencia de datos en streaming.</w:t>
+      </w:r>
+    </w:p>
+    <w:p>
+      <w:pPr>
+        <w:spacing w:after="80"/>
+      </w:pPr>
+      <w:r>
+        <w:rPr>
+          <w:b w:val="0"/>
+          <w:i w:val="0"/>
+          <w:sz w:val="22"/>
+        </w:rPr>
+        <w:t>&gt;</w:t>
+      </w:r>
+    </w:p>
+    <w:p>
+      <w:pPr>
+        <w:spacing w:after="80"/>
+        <w:ind w:left="567"/>
+        <w:shd w:val="clear" w:color="auto" w:fill="EFF6FF"/>
+      </w:pPr>
+      <w:r>
+        <w:rPr>
+          <w:i/>
+          <w:color w:val="1E3A8A"/>
+          <w:sz w:val="21"/>
+        </w:rPr>
+        <w:t>[Señalar flecha de replicación pipeline]</w:t>
+      </w:r>
+    </w:p>
+    <w:p>
+      <w:pPr>
+        <w:spacing w:after="80"/>
+      </w:pPr>
+      <w:r>
+        <w:rPr>
+          <w:b w:val="0"/>
+          <w:i w:val="0"/>
+          <w:sz w:val="22"/>
+        </w:rPr>
+        <w:t>&gt;</w:t>
+      </w:r>
+    </w:p>
+    <w:p>
+      <w:pPr>
+        <w:spacing w:after="80"/>
+        <w:ind w:left="567"/>
+        <w:shd w:val="clear" w:color="auto" w:fill="EFF6FF"/>
+      </w:pPr>
+      <w:r>
+        <w:rPr>
+          <w:i/>
+          <w:color w:val="1E3A8A"/>
+          <w:sz w:val="21"/>
+        </w:rPr>
+        <w:t>Un punto clave del diseño es la replicación pipeline: cuando el cliente sube un bloque, lo envía solo al primer DataNode. Ese nodo lo reenvía al segundo, y el segundo al tercero. Así el cliente solo usa su ancho de banda una vez, y los DataNodes se encargan de la replicación entre sí, igual que hace HDFS."</w:t>
+      </w:r>
+    </w:p>
+    <w:p>
+      <w:pPr>
+        <w:spacing w:after="40"/>
+      </w:pPr>
+    </w:p>
+    <w:p>
+      <w:pPr>
+        <w:spacing w:after="40"/>
+      </w:pPr>
+    </w:p>
+    <w:p>
+      <w:pPr>
+        <w:spacing w:after="40"/>
+      </w:pPr>
+    </w:p>
+    <w:p>
+      <w:pPr>
+        <w:pStyle w:val="Heading3"/>
+      </w:pPr>
+      <w:r>
+        <w:rPr>
+          <w:color w:val="6D28D9"/>
+        </w:rPr>
+        <w:t>SEGMENTO 3 – RECORRIDO POR EL CÓDIGO (3 min)</w:t>
+      </w:r>
+    </w:p>
+    <w:p>
+      <w:pPr>
+        <w:spacing w:after="80"/>
+        <w:ind w:left="567"/>
+        <w:shd w:val="clear" w:color="auto" w:fill="EFF6FF"/>
+      </w:pPr>
+      <w:r>
+        <w:rPr>
+          <w:i/>
+          <w:color w:val="1E3A8A"/>
+          <w:sz w:val="21"/>
+        </w:rPr>
+        <w:t>📺 Pantalla: VS Code con el proyecto abierto</w:t>
+      </w:r>
+    </w:p>
+    <w:p>
+      <w:pPr>
+        <w:spacing w:after="40"/>
+      </w:pPr>
+    </w:p>
+    <w:p>
+      <w:pPr>
+        <w:spacing w:after="80"/>
       </w:pPr>
       <w:r>
         <w:rPr>
           <w:b/>
-          <w:color w:val="92400E"/>
-          <w:sz w:val="18"/>
+          <w:i w:val="0"/>
+          <w:color w:val="0F766E"/>
+          <w:sz w:val="22"/>
         </w:rPr>
-        <w:t>Pantalla: Compartir pantalla → abrir README.md o Informe Word con los diagramas de arquitectura</w:t>
+        <w:t>[Abrir VS Code, mostrar la estructura de carpetas]</w:t>
       </w:r>
     </w:p>
-    <w:p/>
     <w:p>
       <w:pPr>
-        <w:spacing w:before="60" w:after="60"/>
-        <w:ind w:left="283"/>
+        <w:spacing w:after="40"/>
+      </w:pPr>
+    </w:p>
+    <w:p>
+      <w:pPr>
+        <w:spacing w:after="80"/>
+        <w:ind w:left="567"/>
+        <w:shd w:val="clear" w:color="auto" w:fill="EFF6FF"/>
+      </w:pPr>
+      <w:r>
+        <w:rPr>
+          <w:i/>
+          <w:color w:val="1E3A8A"/>
+          <w:sz w:val="21"/>
+        </w:rPr>
+        <w:t>"Veamos rápidamente la estructura del proyecto. Tenemos cuatro carpetas principales.</w:t>
+      </w:r>
+    </w:p>
+    <w:p>
+      <w:pPr>
+        <w:spacing w:after="80"/>
+      </w:pPr>
+      <w:r>
+        <w:rPr>
+          <w:b w:val="0"/>
+          <w:i w:val="0"/>
+          <w:sz w:val="22"/>
+        </w:rPr>
+        <w:t>&gt;</w:t>
+      </w:r>
+    </w:p>
+    <w:p>
+      <w:pPr>
+        <w:spacing w:after="80"/>
+        <w:ind w:left="567"/>
+        <w:shd w:val="clear" w:color="auto" w:fill="EFF6FF"/>
+      </w:pPr>
+      <w:r>
+        <w:rPr>
+          <w:i/>
+          <w:color w:val="1E3A8A"/>
+          <w:sz w:val="21"/>
+        </w:rPr>
+        <w:t>En proto/ está el contrato gRPC, el archivo dfs.proto que define todos los servicios y mensajes del sistema. Este es el punto de verdad de toda la comunicación."</w:t>
+      </w:r>
+    </w:p>
+    <w:p>
+      <w:pPr>
+        <w:spacing w:after="40"/>
+      </w:pPr>
+    </w:p>
+    <w:p>
+      <w:pPr>
+        <w:spacing w:after="80"/>
       </w:pPr>
       <w:r>
         <w:rPr>
           <w:b/>
+          <w:i w:val="0"/>
           <w:color w:val="0F766E"/>
-          <w:sz w:val="20"/>
-        </w:rPr>
-        <w:t>[Senalar el diagrama de arquitectura general]</w:t>
-      </w:r>
-    </w:p>
-    <w:p>
-      <w:pPr>
-        <w:spacing w:after="80"/>
-        <w:ind w:left="567"/>
-      </w:pPr>
-      <w:r>
-        <w:rPr>
-          <w:i/>
-          <w:color w:val="1E40AF"/>
           <w:sz w:val="22"/>
-        </w:rPr>
-        <w:t>"La arquitectura sigue el patron Maestro-Trabajadores. Tenemos tres componentes principales."</w:t>
-      </w:r>
-    </w:p>
-    <w:p>
-      <w:pPr>
-        <w:spacing w:before="60" w:after="60"/>
-        <w:ind w:left="283"/>
-      </w:pPr>
-      <w:r>
-        <w:rPr>
-          <w:b/>
-          <w:color w:val="0F766E"/>
-          <w:sz w:val="20"/>
-        </w:rPr>
-        <w:t>[Senalar el bloque del NameNode]</w:t>
-      </w:r>
-    </w:p>
-    <w:p>
-      <w:pPr>
-        <w:spacing w:after="80"/>
-        <w:ind w:left="567"/>
-      </w:pPr>
-      <w:r>
-        <w:rPr>
-          <w:i/>
-          <w:color w:val="1E40AF"/>
-          <w:sz w:val="22"/>
-        </w:rPr>
-        <w:t>"Primero, el NameNode: es el cerebro del sistema. Gestiona todos los metadatos, la autenticacion de usuarios con tokens JWT, el espacio de nombres de archivos y coordina donde se almacena cada bloque. Corre en el puerto 50051."</w:t>
-      </w:r>
-    </w:p>
-    <w:p>
-      <w:pPr>
-        <w:spacing w:before="60" w:after="60"/>
-        <w:ind w:left="283"/>
-      </w:pPr>
-      <w:r>
-        <w:rPr>
-          <w:b/>
-          <w:color w:val="0F766E"/>
-          <w:sz w:val="20"/>
-        </w:rPr>
-        <w:t>[Senalar los bloques de DataNodes]</w:t>
-      </w:r>
-    </w:p>
-    <w:p>
-      <w:pPr>
-        <w:spacing w:after="80"/>
-        <w:ind w:left="567"/>
-      </w:pPr>
-      <w:r>
-        <w:rPr>
-          <w:i/>
-          <w:color w:val="1E40AF"/>
-          <w:sz w:val="22"/>
-        </w:rPr>
-        <w:t>"Segundo, los DataNodes: son los trabajadores de almacenamiento. Tenemos tres: dn1, dn2 y dn3, corriendo en los puertos 50061, 50062 y 50063. Cada uno almacena bloques en disco con verificacion de integridad SHA-256."</w:t>
-      </w:r>
-    </w:p>
-    <w:p>
-      <w:pPr>
-        <w:spacing w:before="60" w:after="60"/>
-        <w:ind w:left="283"/>
-      </w:pPr>
-      <w:r>
-        <w:rPr>
-          <w:b/>
-          <w:color w:val="0F766E"/>
-          <w:sz w:val="20"/>
-        </w:rPr>
-        <w:t>[Senalar el bloque del Cliente]</w:t>
-      </w:r>
-    </w:p>
-    <w:p>
-      <w:pPr>
-        <w:spacing w:after="80"/>
-        <w:ind w:left="567"/>
-      </w:pPr>
-      <w:r>
-        <w:rPr>
-          <w:i/>
-          <w:color w:val="1E40AF"/>
-          <w:sz w:val="22"/>
-        </w:rPr>
-        <w:t>"Tercero, el Cliente: una interfaz de linea de comandos con la que el usuario sube, descarga y gestiona sus archivos."</w:t>
-      </w:r>
-    </w:p>
-    <w:p>
-      <w:pPr>
-        <w:spacing w:before="60" w:after="60"/>
-        <w:ind w:left="283"/>
-      </w:pPr>
-      <w:r>
-        <w:rPr>
-          <w:b/>
-          <w:color w:val="0F766E"/>
-          <w:sz w:val="20"/>
-        </w:rPr>
-        <w:t>[Senalar las flechas de comunicacion]</w:t>
-      </w:r>
-    </w:p>
-    <w:p>
-      <w:pPr>
-        <w:spacing w:after="80"/>
-        <w:ind w:left="567"/>
-      </w:pPr>
-      <w:r>
-        <w:rPr>
-          <w:i/>
-          <w:color w:val="1E40AF"/>
-          <w:sz w:val="22"/>
-        </w:rPr>
-        <w:t>"La comunicacion entre todos los componentes se hace mediante gRPC con Protocol Buffers, que es mucho mas eficiente que REST para transferencia de datos en streaming."</w:t>
-      </w:r>
-    </w:p>
-    <w:p>
-      <w:pPr>
-        <w:spacing w:before="60" w:after="60"/>
-        <w:ind w:left="283"/>
-      </w:pPr>
-      <w:r>
-        <w:rPr>
-          <w:b/>
-          <w:color w:val="0F766E"/>
-          <w:sz w:val="20"/>
-        </w:rPr>
-        <w:t>[Senalar la flecha de pipeline en la parte inferior]</w:t>
-      </w:r>
-    </w:p>
-    <w:p>
-      <w:pPr>
-        <w:spacing w:after="80"/>
-        <w:ind w:left="567"/>
-      </w:pPr>
-      <w:r>
-        <w:rPr>
-          <w:i/>
-          <w:color w:val="1E40AF"/>
-          <w:sz w:val="22"/>
-        </w:rPr>
-        <w:t>"Un punto clave del diseno es la replicacion pipeline: cuando el cliente sube un bloque, lo envia solo al primer DataNode. Ese nodo lo reenvía al segundo, y el segundo al tercero. Asi el cliente solo usa su ancho de banda una vez, y los DataNodes se encargan de la replicacion entre si, igual que hace HDFS."</w:t>
-      </w:r>
-    </w:p>
-    <w:p>
-      <w:r>
-        <w:t>______________________________________________________________________</w:t>
-      </w:r>
-    </w:p>
-    <w:p>
-      <w:pPr>
-        <w:pStyle w:val="Heading1"/>
-        <w:jc w:val="left"/>
-      </w:pPr>
-      <w:r>
-        <w:rPr>
-          <w:color w:val="1E3A8A"/>
-        </w:rPr>
-        <w:t>SEGMENTO 3 – Recorrido por el Codigo  (3 minutos)</w:t>
-      </w:r>
-    </w:p>
-    <w:p>
-      <w:pPr>
-        <w:ind w:left="283"/>
-      </w:pPr>
-      <w:r>
-        <w:rPr>
-          <w:b/>
-          <w:color w:val="92400E"/>
-          <w:sz w:val="18"/>
-        </w:rPr>
-        <w:t>Pantalla: VS Code abierto con el proyecto Proyecto-DFS-Sistemas-distribuidos</w:t>
-      </w:r>
-    </w:p>
-    <w:p/>
-    <w:p>
-      <w:pPr>
-        <w:spacing w:before="60" w:after="60"/>
-        <w:ind w:left="283"/>
-      </w:pPr>
-      <w:r>
-        <w:rPr>
-          <w:b/>
-          <w:color w:val="0F766E"/>
-          <w:sz w:val="20"/>
-        </w:rPr>
-        <w:t>[Mostrar la estructura de carpetas en el explorador de VS Code]</w:t>
-      </w:r>
-    </w:p>
-    <w:p>
-      <w:pPr>
-        <w:spacing w:after="80"/>
-        <w:ind w:left="567"/>
-      </w:pPr>
-      <w:r>
-        <w:rPr>
-          <w:i/>
-          <w:color w:val="1E40AF"/>
-          <w:sz w:val="22"/>
-        </w:rPr>
-        <w:t>"Veamos rapidamente la estructura del proyecto. Tenemos cuatro carpetas principales."</w:t>
-      </w:r>
-    </w:p>
-    <w:p>
-      <w:pPr>
-        <w:spacing w:before="60" w:after="60"/>
-        <w:ind w:left="283"/>
-      </w:pPr>
-      <w:r>
-        <w:rPr>
-          <w:b/>
-          <w:color w:val="0F766E"/>
-          <w:sz w:val="20"/>
         </w:rPr>
         <w:t>[Abrir proto/dfs.proto]</w:t>
       </w:r>
     </w:p>
     <w:p>
       <w:pPr>
+        <w:spacing w:after="40"/>
+      </w:pPr>
+    </w:p>
+    <w:p>
+      <w:pPr>
         <w:spacing w:after="80"/>
         <w:ind w:left="567"/>
+        <w:shd w:val="clear" w:color="auto" w:fill="EFF6FF"/>
       </w:pPr>
       <w:r>
         <w:rPr>
           <w:i/>
-          <w:color w:val="1E40AF"/>
-          <w:sz w:val="22"/>
+          <w:color w:val="1E3A8A"/>
+          <w:sz w:val="21"/>
         </w:rPr>
-        <w:t>"En proto/ esta el contrato gRPC, el archivo dfs.proto que define todos los servicios y mensajes del sistema. Este es el punto de verdad de toda la comunicacion."</w:t>
+        <w:t>"Aquí podemos ver por ejemplo el servicio StoreBlock, que es client-streaming, lo que significa que el cliente envía el bloque en chunks de 4 megabytes. Y RetrieveBlock es server-streaming, el DataNode le envía el bloque al cliente en chunks de 1 megabyte."</w:t>
       </w:r>
     </w:p>
     <w:p>
       <w:pPr>
-        <w:spacing w:after="80"/>
-        <w:ind w:left="567"/>
-      </w:pPr>
-      <w:r>
-        <w:rPr>
-          <w:i/>
-          <w:color w:val="1E40AF"/>
-          <w:sz w:val="22"/>
-        </w:rPr>
-        <w:t>"Aqui podemos ver por ejemplo el servicio StoreBlock, que es client-streaming, lo que significa que el cliente envia el bloque en chunks de 4 megabytes. Y RetrieveBlock es server-streaming: el DataNode le envia el bloque al cliente en chunks de 1 megabyte."</w:t>
-      </w:r>
+        <w:spacing w:after="40"/>
+      </w:pPr>
     </w:p>
     <w:p>
       <w:pPr>
-        <w:spacing w:before="60" w:after="60"/>
-        <w:ind w:left="283"/>
+        <w:spacing w:after="80"/>
       </w:pPr>
       <w:r>
         <w:rPr>
           <w:b/>
+          <w:i w:val="0"/>
           <w:color w:val="0F766E"/>
-          <w:sz w:val="20"/>
+          <w:sz w:val="22"/>
         </w:rPr>
         <w:t>[Abrir namenode/heartbeat_monitor.py]</w:t>
       </w:r>
     </w:p>
     <w:p>
       <w:pPr>
+        <w:spacing w:after="40"/>
+      </w:pPr>
+    </w:p>
+    <w:p>
+      <w:pPr>
         <w:spacing w:after="80"/>
         <w:ind w:left="567"/>
+        <w:shd w:val="clear" w:color="auto" w:fill="EFF6FF"/>
       </w:pPr>
       <w:r>
         <w:rPr>
           <w:i/>
-          <w:color w:val="1E40AF"/>
-          <w:sz w:val="22"/>
+          <w:color w:val="1E3A8A"/>
+          <w:sz w:val="21"/>
         </w:rPr>
-        <w:t>"En el NameNode, el componente mas interesante es el HeartbeatMonitor. Es un thread daemon que corre en segundo plano y monitorea si los DataNodes siguen vivos. Cada DataNode envia un heartbeat cada 10 segundos. Si pasan mas de 30 segundos sin heartbeat, el NameNode marca ese nodo como inactivo y automaticamente busca los bloques que quedaron sub-replicados para replicarlos en otros nodos disponibles. Esto es lo que nos da la tolerancia a fallos."</w:t>
+        <w:t>"En el NameNode, el componente más interesante es el HeartbeatMonitor. Es un thread daemon que corre en segundo plano y monitorea si los DataNodes siguen vivos. Cada DataNode envía un heartbeat cada 10 segundos. Si pasan más de 30 segundos sin heartbeat, el NameNode marca ese nodo como inactivo y automáticamente busca los bloques que quedaron sub-replicados para replicarlos en otros nodos disponibles. Esto es lo que nos da la tolerancia a fallos."</w:t>
       </w:r>
     </w:p>
     <w:p>
       <w:pPr>
-        <w:spacing w:before="60" w:after="60"/>
-        <w:ind w:left="283"/>
+        <w:spacing w:after="40"/>
+      </w:pPr>
+    </w:p>
+    <w:p>
+      <w:pPr>
+        <w:spacing w:after="80"/>
       </w:pPr>
       <w:r>
         <w:rPr>
           <w:b/>
+          <w:i w:val="0"/>
           <w:color w:val="0F766E"/>
-          <w:sz w:val="20"/>
+          <w:sz w:val="22"/>
         </w:rPr>
         <w:t>[Abrir datanode/block_store.py]</w:t>
       </w:r>
     </w:p>
     <w:p>
       <w:pPr>
+        <w:spacing w:after="40"/>
+      </w:pPr>
+    </w:p>
+    <w:p>
+      <w:pPr>
         <w:spacing w:after="80"/>
         <w:ind w:left="567"/>
+        <w:shd w:val="clear" w:color="auto" w:fill="EFF6FF"/>
       </w:pPr>
       <w:r>
         <w:rPr>
           <w:i/>
-          <w:color w:val="1E40AF"/>
-          <w:sz w:val="22"/>
+          <w:color w:val="1E3A8A"/>
+          <w:sz w:val="21"/>
         </w:rPr>
-        <w:t>"En el DataNode, el BlockStore es donde se almacenan fisicamente los bloques en disco. Cada vez que se escribe un bloque, se calcula su SHA-256 y se guarda junto al bloque. Al momento de leer, se vuelve a calcular y se compara. Si no coinciden, el bloque esta corrupto y el sistema automaticamente busca una replica en otro nodo."</w:t>
+        <w:t>"En el DataNode, el BlockStore es donde se almacenan físicamente los bloques en disco. Cada vez que se escribe un bloque, se calcula su SHA-256 y se guarda junto al bloque. Al momento de leer, se vuelve a calcular y se compara. Si no coinciden, el bloque está corrupto y el sistema automáticamente busca una réplica en otro nodo."</w:t>
       </w:r>
     </w:p>
     <w:p>
       <w:pPr>
-        <w:spacing w:before="60" w:after="60"/>
-        <w:ind w:left="283"/>
+        <w:spacing w:after="40"/>
+      </w:pPr>
+    </w:p>
+    <w:p>
+      <w:pPr>
+        <w:spacing w:after="80"/>
       </w:pPr>
       <w:r>
         <w:rPr>
           <w:b/>
+          <w:i w:val="0"/>
           <w:color w:val="0F766E"/>
-          <w:sz w:val="20"/>
+          <w:sz w:val="22"/>
         </w:rPr>
         <w:t>[Abrir client/cli.py]</w:t>
       </w:r>
     </w:p>
     <w:p>
       <w:pPr>
+        <w:spacing w:after="40"/>
+      </w:pPr>
+    </w:p>
+    <w:p>
+      <w:pPr>
         <w:spacing w:after="80"/>
         <w:ind w:left="567"/>
+        <w:shd w:val="clear" w:color="auto" w:fill="EFF6FF"/>
       </w:pPr>
       <w:r>
         <w:rPr>
           <w:i/>
-          <w:color w:val="1E40AF"/>
-          <w:sz w:val="22"/>
+          <w:color w:val="1E3A8A"/>
+          <w:sz w:val="21"/>
         </w:rPr>
-        <w:t>"Y finalmente el cliente. La CLI implementa todos los comandos requeridos: put, get, ls, mkdir, rmdir, rm, register y login. La autenticacion usa JWT, por lo que el token se persiste localmente y se envia en cada solicitud al NameNode."</w:t>
+        <w:t>"Y finalmente el cliente. La CLI implementa todos los comandos requeridos: put, get, ls, mkdir, rmdir, rm, register y login. La autenticación usa JWT, por lo que el token se persiste localmente y se envía en cada solicitud al NameNode."</w:t>
       </w:r>
     </w:p>
     <w:p>
+      <w:pPr>
+        <w:spacing w:after="40"/>
+      </w:pPr>
+    </w:p>
+    <w:p>
+      <w:pPr>
+        <w:spacing w:after="40"/>
+      </w:pPr>
+    </w:p>
+    <w:p>
+      <w:pPr>
+        <w:spacing w:after="40"/>
+      </w:pPr>
+    </w:p>
+    <w:p>
+      <w:pPr>
+        <w:pStyle w:val="Heading3"/>
+      </w:pPr>
       <w:r>
-        <w:t>______________________________________________________________________</w:t>
+        <w:rPr>
+          <w:color w:val="6D28D9"/>
+        </w:rPr>
+        <w:t>SEGMENTO 4 – DEMO EN VIVO AWS EC2 (5 min)</w:t>
       </w:r>
     </w:p>
     <w:p>
       <w:pPr>
-        <w:pStyle w:val="Heading1"/>
-        <w:jc w:val="left"/>
+        <w:spacing w:after="80"/>
+        <w:ind w:left="567"/>
+        <w:shd w:val="clear" w:color="auto" w:fill="EFF6FF"/>
       </w:pPr>
       <w:r>
         <w:rPr>
+          <w:i/>
           <w:color w:val="1E3A8A"/>
+          <w:sz w:val="21"/>
         </w:rPr>
-        <w:t>SEGMENTO 4 – Demo en Vivo AWS EC2  (5 minutos)</w:t>
+        <w:t>📺 Pantalla: 4 terminales SSH abiertas + PowerShell local</w:t>
       </w:r>
     </w:p>
     <w:p>
       <w:pPr>
-        <w:ind w:left="283"/>
+        <w:spacing w:after="40"/>
+      </w:pPr>
+    </w:p>
+    <w:p>
+      <w:pPr>
+        <w:spacing w:after="80"/>
       </w:pPr>
       <w:r>
         <w:rPr>
           <w:b/>
-          <w:color w:val="92400E"/>
-          <w:sz w:val="18"/>
+          <w:i w:val="0"/>
+          <w:color w:val="0F766E"/>
+          <w:sz w:val="22"/>
         </w:rPr>
-        <w:t>Pantalla: 4 terminales SSH abiertas, una por instancia EC2</w:t>
+        <w:t>[Mostrar las 4 terminales, cada una conectada a una instancia EC2]</w:t>
       </w:r>
     </w:p>
-    <w:p/>
     <w:p>
       <w:pPr>
-        <w:spacing w:before="60" w:after="60"/>
-        <w:ind w:left="283"/>
+        <w:spacing w:after="40"/>
+      </w:pPr>
+    </w:p>
+    <w:p>
+      <w:pPr>
+        <w:spacing w:after="80"/>
+        <w:ind w:left="567"/>
+        <w:shd w:val="clear" w:color="auto" w:fill="EFF6FF"/>
+      </w:pPr>
+      <w:r>
+        <w:rPr>
+          <w:i/>
+          <w:color w:val="1E3A8A"/>
+          <w:sz w:val="21"/>
+        </w:rPr>
+        <w:t>"Bien, vamos a la parte más importante: la demostración en vivo. Tengo cuatro instancias de AWS EC2 corriendo en us-east-1. En esta terminal está el NameNode con IP privada 172.31.0.165. Y en estas tres están los DataNodes."</w:t>
+      </w:r>
+    </w:p>
+    <w:p>
+      <w:pPr>
+        <w:spacing w:after="40"/>
+      </w:pPr>
+    </w:p>
+    <w:p>
+      <w:pPr>
+        <w:spacing w:after="80"/>
       </w:pPr>
       <w:r>
         <w:rPr>
           <w:b/>
+          <w:i w:val="0"/>
           <w:color w:val="0F766E"/>
-          <w:sz w:val="20"/>
-        </w:rPr>
-        <w:t>[Mostrar las 4 terminales simultaneamente]</w:t>
-      </w:r>
-    </w:p>
-    <w:p>
-      <w:pPr>
-        <w:spacing w:after="80"/>
-        <w:ind w:left="567"/>
-      </w:pPr>
-      <w:r>
-        <w:rPr>
-          <w:i/>
-          <w:color w:val="1E40AF"/>
           <w:sz w:val="22"/>
-        </w:rPr>
-        <w:t>"Bien, vamos a la parte mas importante: la demostracion en vivo. Tengo cuatro instancias de AWS EC2 corriendo en la region us-east-1. En esta terminal esta el NameNode con IP privada 172.31.0.165. Y en estas tres estan los DataNodes."</w:t>
-      </w:r>
-    </w:p>
-    <w:p>
-      <w:pPr>
-        <w:spacing w:before="60" w:after="60"/>
-        <w:ind w:left="283"/>
-      </w:pPr>
-      <w:r>
-        <w:rPr>
-          <w:b/>
-          <w:color w:val="0F766E"/>
-          <w:sz w:val="20"/>
         </w:rPr>
         <w:t>[Ir a terminal del NameNode]</w:t>
       </w:r>
     </w:p>
     <w:p>
       <w:pPr>
+        <w:spacing w:after="40"/>
+      </w:pPr>
+    </w:p>
+    <w:p>
+      <w:pPr>
         <w:spacing w:before="40" w:after="40"/>
-        <w:ind w:left="850"/>
+        <w:ind w:left="454"/>
+        <w:shd w:val="clear" w:color="auto" w:fill="F1F5F9"/>
+      </w:pPr>
+      <w:r>
+        <w:rPr>
+          <w:rFonts w:ascii="Courier New" w:hAnsi="Courier New"/>
+          <w:color w:val="1E40AF"/>
+          <w:sz w:val="18"/>
+        </w:rPr>
+        <w:t>docker ps</w:t>
+      </w:r>
+    </w:p>
+    <w:p/>
+    <w:p>
+      <w:pPr>
+        <w:spacing w:after="80"/>
+        <w:ind w:left="567"/>
+        <w:shd w:val="clear" w:color="auto" w:fill="EFF6FF"/>
+      </w:pPr>
+      <w:r>
+        <w:rPr>
+          <w:i/>
+          <w:color w:val="1E3A8A"/>
+          <w:sz w:val="21"/>
+        </w:rPr>
+        <w:t>"Vemos que el contenedor minidfs-namenode está corriendo y en estado healthy. Puerto 50051 expuesto."</w:t>
+      </w:r>
+    </w:p>
+    <w:p>
+      <w:pPr>
+        <w:spacing w:after="40"/>
+      </w:pPr>
+    </w:p>
+    <w:p>
+      <w:pPr>
+        <w:spacing w:after="80"/>
+      </w:pPr>
+      <w:r>
+        <w:rPr>
+          <w:b/>
+          <w:i w:val="0"/>
+          <w:color w:val="0F766E"/>
+          <w:sz w:val="22"/>
+        </w:rPr>
+        <w:t>[Ir a terminal DataNode 1]</w:t>
+      </w:r>
+    </w:p>
+    <w:p>
+      <w:pPr>
+        <w:spacing w:before="40" w:after="40"/>
+        <w:ind w:left="454"/>
         <w:shd w:val="clear" w:color="auto" w:fill="F1F5F9"/>
       </w:pPr>
       <w:r>
@@ -997,51 +1178,8 @@
     </w:p>
     <w:p>
       <w:pPr>
-        <w:spacing w:after="80"/>
-        <w:ind w:left="567"/>
-      </w:pPr>
-      <w:r>
-        <w:rPr>
-          <w:i/>
-          <w:color w:val="1E40AF"/>
-          <w:sz w:val="22"/>
-        </w:rPr>
-        <w:t>"Vemos que el contenedor minidfs-namenode esta corriendo y en estado healthy. Puerto 50051 expuesto."</w:t>
-      </w:r>
-    </w:p>
-    <w:p>
-      <w:pPr>
-        <w:spacing w:before="60" w:after="60"/>
-        <w:ind w:left="283"/>
-      </w:pPr>
-      <w:r>
-        <w:rPr>
-          <w:b/>
-          <w:color w:val="0F766E"/>
-          <w:sz w:val="20"/>
-        </w:rPr>
-        <w:t>[Ir a terminal DataNode 1]</w:t>
-      </w:r>
-    </w:p>
-    <w:p>
-      <w:pPr>
         <w:spacing w:before="40" w:after="40"/>
-        <w:ind w:left="850"/>
-        <w:shd w:val="clear" w:color="auto" w:fill="F1F5F9"/>
-      </w:pPr>
-      <w:r>
-        <w:rPr>
-          <w:rFonts w:ascii="Courier New" w:hAnsi="Courier New"/>
-          <w:color w:val="1E40AF"/>
-          <w:sz w:val="18"/>
-        </w:rPr>
-        <w:t>docker ps</w:t>
-      </w:r>
-    </w:p>
-    <w:p>
-      <w:pPr>
-        <w:spacing w:before="40" w:after="40"/>
-        <w:ind w:left="850"/>
+        <w:ind w:left="454"/>
         <w:shd w:val="clear" w:color="auto" w:fill="F1F5F9"/>
       </w:pPr>
       <w:r>
@@ -1053,38 +1191,45 @@
         <w:t>docker logs minidfs-datanode1 --tail 5</w:t>
       </w:r>
     </w:p>
+    <w:p/>
     <w:p>
       <w:pPr>
         <w:spacing w:after="80"/>
         <w:ind w:left="567"/>
+        <w:shd w:val="clear" w:color="auto" w:fill="EFF6FF"/>
       </w:pPr>
       <w:r>
         <w:rPr>
           <w:i/>
-          <w:color w:val="1E40AF"/>
-          <w:sz w:val="22"/>
+          <w:color w:val="1E3A8A"/>
+          <w:sz w:val="21"/>
         </w:rPr>
-        <w:t>"DataNode 1 esta conectado al NameNode en 172.31.0.165 y enviando BlockReports periodicamente."</w:t>
+        <w:t>"DataNode 1 está conectado al NameNode en 172.31.0.165 y enviando BlockReports periódicamente."</w:t>
       </w:r>
     </w:p>
     <w:p>
       <w:pPr>
-        <w:spacing w:before="60" w:after="60"/>
-        <w:ind w:left="283"/>
+        <w:spacing w:after="40"/>
+      </w:pPr>
+    </w:p>
+    <w:p>
+      <w:pPr>
+        <w:spacing w:after="80"/>
       </w:pPr>
       <w:r>
         <w:rPr>
           <w:b/>
+          <w:i w:val="0"/>
           <w:color w:val="0F766E"/>
-          <w:sz w:val="20"/>
+          <w:sz w:val="22"/>
         </w:rPr>
-        <w:t>[Ir a logs del NameNode]</w:t>
+        <w:t>[Ir a terminal del NameNode, ver logs]</w:t>
       </w:r>
     </w:p>
     <w:p>
       <w:pPr>
         <w:spacing w:before="40" w:after="40"/>
-        <w:ind w:left="850"/>
+        <w:ind w:left="454"/>
         <w:shd w:val="clear" w:color="auto" w:fill="F1F5F9"/>
       </w:pPr>
       <w:r>
@@ -1096,24 +1241,40 @@
         <w:t>docker logs minidfs-namenode --tail 15</w:t>
       </w:r>
     </w:p>
+    <w:p/>
     <w:p>
       <w:pPr>
         <w:spacing w:after="80"/>
         <w:ind w:left="567"/>
+        <w:shd w:val="clear" w:color="auto" w:fill="EFF6FF"/>
       </w:pPr>
       <w:r>
         <w:rPr>
           <w:i/>
-          <w:color w:val="1E40AF"/>
-          <w:sz w:val="22"/>
+          <w:color w:val="1E3A8A"/>
+          <w:sz w:val="21"/>
         </w:rPr>
-        <w:t>"Aqui en los logs del NameNode vemos los BlockReports que llegan de dn1, dn2 y dn3. El cluster esta completamente operativo."</w:t>
+        <w:t>"Aquí en los logs del NameNode vemos los BlockReports que llegan de dn1, dn2 y dn3. El clúster está completamente operativo."</w:t>
       </w:r>
     </w:p>
-    <w:p/>
     <w:p>
       <w:pPr>
-        <w:spacing w:after="100"/>
+        <w:spacing w:after="40"/>
+      </w:pPr>
+    </w:p>
+    <w:p>
+      <w:pPr>
+        <w:spacing w:after="40"/>
+      </w:pPr>
+    </w:p>
+    <w:p>
+      <w:pPr>
+        <w:spacing w:after="40"/>
+      </w:pPr>
+    </w:p>
+    <w:p>
+      <w:pPr>
+        <w:spacing w:after="80"/>
       </w:pPr>
       <w:r>
         <w:rPr>
@@ -1122,27 +1283,18 @@
           <w:color w:val="0F766E"/>
           <w:sz w:val="22"/>
         </w:rPr>
-        <w:t>--- Inicio de la demo del cliente ---</w:t>
+        <w:t>[Ir a la terminal con el cliente activo (venv activado)]</w:t>
       </w:r>
     </w:p>
     <w:p>
       <w:pPr>
-        <w:spacing w:before="60" w:after="60"/>
-        <w:ind w:left="283"/>
-      </w:pPr>
-      <w:r>
-        <w:rPr>
-          <w:b/>
-          <w:color w:val="0F766E"/>
-          <w:sz w:val="20"/>
-        </w:rPr>
-        <w:t>[Ir a terminal con cliente activo (venv activado)]</w:t>
-      </w:r>
+        <w:spacing w:after="40"/>
+      </w:pPr>
     </w:p>
     <w:p>
       <w:pPr>
         <w:spacing w:before="40" w:after="40"/>
-        <w:ind w:left="850"/>
+        <w:ind w:left="454"/>
         <w:shd w:val="clear" w:color="auto" w:fill="F1F5F9"/>
       </w:pPr>
       <w:r>
@@ -1157,7 +1309,7 @@
     <w:p>
       <w:pPr>
         <w:spacing w:before="40" w:after="40"/>
-        <w:ind w:left="850"/>
+        <w:ind w:left="454"/>
         <w:shd w:val="clear" w:color="auto" w:fill="F1F5F9"/>
       </w:pPr>
       <w:r>
@@ -1169,24 +1321,36 @@
         <w:t>source ~/venv-dfs/bin/activate</w:t>
       </w:r>
     </w:p>
+    <w:p/>
+    <w:p>
+      <w:pPr>
+        <w:spacing w:after="40"/>
+      </w:pPr>
+    </w:p>
     <w:p>
       <w:pPr>
         <w:spacing w:after="80"/>
         <w:ind w:left="567"/>
+        <w:shd w:val="clear" w:color="auto" w:fill="EFF6FF"/>
       </w:pPr>
       <w:r>
         <w:rPr>
           <w:i/>
-          <w:color w:val="1E40AF"/>
-          <w:sz w:val="22"/>
+          <w:color w:val="1E3A8A"/>
+          <w:sz w:val="21"/>
         </w:rPr>
         <w:t>"Ahora vamos a usar el cliente. Primero registro un usuario y me autentico:"</w:t>
       </w:r>
     </w:p>
     <w:p>
       <w:pPr>
+        <w:spacing w:after="40"/>
+      </w:pPr>
+    </w:p>
+    <w:p>
+      <w:pPr>
         <w:spacing w:before="40" w:after="40"/>
-        <w:ind w:left="850"/>
+        <w:ind w:left="454"/>
         <w:shd w:val="clear" w:color="auto" w:fill="F1F5F9"/>
       </w:pPr>
       <w:r>
@@ -1201,7 +1365,7 @@
     <w:p>
       <w:pPr>
         <w:spacing w:before="40" w:after="40"/>
-        <w:ind w:left="850"/>
+        <w:ind w:left="454"/>
         <w:shd w:val="clear" w:color="auto" w:fill="F1F5F9"/>
       </w:pPr>
       <w:r>
@@ -1213,68 +1377,31 @@
         <w:t>python cli.py login andres pass123</w:t>
       </w:r>
     </w:p>
+    <w:p/>
     <w:p>
       <w:pPr>
         <w:spacing w:after="80"/>
         <w:ind w:left="567"/>
+        <w:shd w:val="clear" w:color="auto" w:fill="EFF6FF"/>
       </w:pPr>
       <w:r>
         <w:rPr>
           <w:i/>
-          <w:color w:val="1E40AF"/>
-          <w:sz w:val="22"/>
+          <w:color w:val="1E3A8A"/>
+          <w:sz w:val="21"/>
         </w:rPr>
-        <w:t>"Usuario registrado y autenticado. El NameNode genero un token JWT que el cliente guarda localmente."</w:t>
+        <w:t>"Usuario registrado y autenticado. El NameNode generó un token JWT que el cliente guarda localmente."</w:t>
       </w:r>
     </w:p>
     <w:p>
       <w:pPr>
-        <w:spacing w:before="40" w:after="40"/>
-        <w:ind w:left="850"/>
-        <w:shd w:val="clear" w:color="auto" w:fill="F1F5F9"/>
-      </w:pPr>
-      <w:r>
-        <w:rPr>
-          <w:rFonts w:ascii="Courier New" w:hAnsi="Courier New"/>
-          <w:color w:val="1E40AF"/>
-          <w:sz w:val="18"/>
-        </w:rPr>
-        <w:t>python cli.py ls /</w:t>
-      </w:r>
+        <w:spacing w:after="40"/>
+      </w:pPr>
     </w:p>
     <w:p>
       <w:pPr>
-        <w:spacing w:after="80"/>
-        <w:ind w:left="567"/>
-      </w:pPr>
-      <w:r>
-        <w:rPr>
-          <w:i/>
-          <w:color w:val="1E40AF"/>
-          <w:sz w:val="22"/>
-        </w:rPr>
-        <w:t>"El sistema de archivos esta vacio. Creemos un directorio:"</w:t>
-      </w:r>
-    </w:p>
-    <w:p>
-      <w:pPr>
         <w:spacing w:before="40" w:after="40"/>
-        <w:ind w:left="850"/>
-        <w:shd w:val="clear" w:color="auto" w:fill="F1F5F9"/>
-      </w:pPr>
-      <w:r>
-        <w:rPr>
-          <w:rFonts w:ascii="Courier New" w:hAnsi="Courier New"/>
-          <w:color w:val="1E40AF"/>
-          <w:sz w:val="18"/>
-        </w:rPr>
-        <w:t>python cli.py mkdir /demo</w:t>
-      </w:r>
-    </w:p>
-    <w:p>
-      <w:pPr>
-        <w:spacing w:before="40" w:after="40"/>
-        <w:ind w:left="850"/>
+        <w:ind w:left="454"/>
         <w:shd w:val="clear" w:color="auto" w:fill="F1F5F9"/>
       </w:pPr>
       <w:r>
@@ -1291,20 +1418,92 @@
       <w:pPr>
         <w:spacing w:after="80"/>
         <w:ind w:left="567"/>
+        <w:shd w:val="clear" w:color="auto" w:fill="EFF6FF"/>
       </w:pPr>
       <w:r>
         <w:rPr>
           <w:i/>
-          <w:color w:val="1E40AF"/>
-          <w:sz w:val="22"/>
+          <w:color w:val="1E3A8A"/>
+          <w:sz w:val="21"/>
         </w:rPr>
-        <w:t>"Ahora viene la parte mas importante: subir un archivo. Voy a crear un archivo de 10 megabytes con datos aleatorios:"</w:t>
+        <w:t>"El sistema de archivos está vacío. Creemos un directorio:"</w:t>
       </w:r>
     </w:p>
     <w:p>
       <w:pPr>
+        <w:spacing w:after="40"/>
+      </w:pPr>
+    </w:p>
+    <w:p>
+      <w:pPr>
         <w:spacing w:before="40" w:after="40"/>
-        <w:ind w:left="850"/>
+        <w:ind w:left="454"/>
+        <w:shd w:val="clear" w:color="auto" w:fill="F1F5F9"/>
+      </w:pPr>
+      <w:r>
+        <w:rPr>
+          <w:rFonts w:ascii="Courier New" w:hAnsi="Courier New"/>
+          <w:color w:val="1E40AF"/>
+          <w:sz w:val="18"/>
+        </w:rPr>
+        <w:t>python cli.py mkdir /demo</w:t>
+      </w:r>
+    </w:p>
+    <w:p>
+      <w:pPr>
+        <w:spacing w:before="40" w:after="40"/>
+        <w:ind w:left="454"/>
+        <w:shd w:val="clear" w:color="auto" w:fill="F1F5F9"/>
+      </w:pPr>
+      <w:r>
+        <w:rPr>
+          <w:rFonts w:ascii="Courier New" w:hAnsi="Courier New"/>
+          <w:color w:val="1E40AF"/>
+          <w:sz w:val="18"/>
+        </w:rPr>
+        <w:t>python cli.py ls /</w:t>
+      </w:r>
+    </w:p>
+    <w:p/>
+    <w:p>
+      <w:pPr>
+        <w:spacing w:after="40"/>
+      </w:pPr>
+    </w:p>
+    <w:p>
+      <w:pPr>
+        <w:spacing w:after="40"/>
+      </w:pPr>
+    </w:p>
+    <w:p>
+      <w:pPr>
+        <w:spacing w:after="40"/>
+      </w:pPr>
+    </w:p>
+    <w:p>
+      <w:pPr>
+        <w:spacing w:after="80"/>
+        <w:ind w:left="567"/>
+        <w:shd w:val="clear" w:color="auto" w:fill="EFF6FF"/>
+      </w:pPr>
+      <w:r>
+        <w:rPr>
+          <w:i/>
+          <w:color w:val="1E3A8A"/>
+          <w:sz w:val="21"/>
+        </w:rPr>
+        <w:t>"Ahora viene la parte más interesante: subir un archivo. Voy a crear un archivo de prueba de 10 megabytes con datos aleatorios:"</w:t>
+      </w:r>
+    </w:p>
+    <w:p>
+      <w:pPr>
+        <w:spacing w:after="40"/>
+      </w:pPr>
+    </w:p>
+    <w:p>
+      <w:pPr>
+        <w:spacing w:before="40" w:after="40"/>
+        <w:ind w:left="454"/>
         <w:shd w:val="clear" w:color="auto" w:fill="F1F5F9"/>
       </w:pPr>
       <w:r>
@@ -1319,7 +1518,7 @@
     <w:p>
       <w:pPr>
         <w:spacing w:before="40" w:after="40"/>
-        <w:ind w:left="850"/>
+        <w:ind w:left="454"/>
         <w:shd w:val="clear" w:color="auto" w:fill="F1F5F9"/>
       </w:pPr>
       <w:r>
@@ -1331,10 +1530,16 @@
         <w:t>ls -lh /tmp/archivo_demo.bin</w:t>
       </w:r>
     </w:p>
+    <w:p/>
     <w:p>
       <w:pPr>
+        <w:spacing w:after="40"/>
+      </w:pPr>
+    </w:p>
+    <w:p>
+      <w:pPr>
         <w:spacing w:before="40" w:after="40"/>
-        <w:ind w:left="850"/>
+        <w:ind w:left="454"/>
         <w:shd w:val="clear" w:color="auto" w:fill="F1F5F9"/>
       </w:pPr>
       <w:r>
@@ -1346,24 +1551,36 @@
         <w:t>python cli.py put /tmp/archivo_demo.bin /demo/archivo_demo.bin</w:t>
       </w:r>
     </w:p>
+    <w:p/>
+    <w:p>
+      <w:pPr>
+        <w:spacing w:after="40"/>
+      </w:pPr>
+    </w:p>
     <w:p>
       <w:pPr>
         <w:spacing w:after="80"/>
         <w:ind w:left="567"/>
+        <w:shd w:val="clear" w:color="auto" w:fill="EFF6FF"/>
       </w:pPr>
       <w:r>
         <w:rPr>
           <w:i/>
-          <w:color w:val="1E40AF"/>
-          <w:sz w:val="22"/>
+          <w:color w:val="1E3A8A"/>
+          <w:sz w:val="21"/>
         </w:rPr>
-        <w:t>"Observen la salida: el archivo fue dividido en bloques y el bloque fue enviado a un DataNode primario. Vemos el pipeline de replicacion: el bloque viajo de dn1 a dn2 a dn3 automaticamente. 1 de 1 bloques confirmados."</w:t>
+        <w:t>"Observen la salida: el archivo fue dividido en bloques y el bloque fue enviado a un DataNode primario. Vemos el pipeline de replicación: el bloque viajó de dn1 a dn2 a dn3 automáticamente. 1 de 1 bloques confirmados."</w:t>
       </w:r>
     </w:p>
     <w:p>
       <w:pPr>
+        <w:spacing w:after="40"/>
+      </w:pPr>
+    </w:p>
+    <w:p>
+      <w:pPr>
         <w:spacing w:before="40" w:after="40"/>
-        <w:ind w:left="850"/>
+        <w:ind w:left="454"/>
         <w:shd w:val="clear" w:color="auto" w:fill="F1F5F9"/>
       </w:pPr>
       <w:r>
@@ -1375,39 +1592,61 @@
         <w:t>python cli.py ls /demo</w:t>
       </w:r>
     </w:p>
+    <w:p/>
     <w:p>
       <w:pPr>
         <w:spacing w:after="80"/>
         <w:ind w:left="567"/>
+        <w:shd w:val="clear" w:color="auto" w:fill="EFF6FF"/>
       </w:pPr>
       <w:r>
         <w:rPr>
           <w:i/>
-          <w:color w:val="1E40AF"/>
-          <w:sz w:val="22"/>
+          <w:color w:val="1E3A8A"/>
+          <w:sz w:val="21"/>
         </w:rPr>
-        <w:t>"Podemos ver el archivo en el DFS con su tamano correcto."</w:t>
+        <w:t>"Podemos ver el archivo en el DFS con su tamaño correcto."</w:t>
       </w:r>
     </w:p>
-    <w:p/>
+    <w:p>
+      <w:pPr>
+        <w:spacing w:after="40"/>
+      </w:pPr>
+    </w:p>
+    <w:p>
+      <w:pPr>
+        <w:spacing w:after="40"/>
+      </w:pPr>
+    </w:p>
+    <w:p>
+      <w:pPr>
+        <w:spacing w:after="40"/>
+      </w:pPr>
+    </w:p>
     <w:p>
       <w:pPr>
         <w:spacing w:after="80"/>
         <w:ind w:left="567"/>
+        <w:shd w:val="clear" w:color="auto" w:fill="EFF6FF"/>
       </w:pPr>
       <w:r>
         <w:rPr>
           <w:i/>
-          <w:color w:val="1E40AF"/>
-          <w:sz w:val="22"/>
+          <w:color w:val="1E3A8A"/>
+          <w:sz w:val="21"/>
         </w:rPr>
         <w:t>"Ahora lo descargamos:"</w:t>
       </w:r>
     </w:p>
     <w:p>
       <w:pPr>
+        <w:spacing w:after="40"/>
+      </w:pPr>
+    </w:p>
+    <w:p>
+      <w:pPr>
         <w:spacing w:before="40" w:after="40"/>
-        <w:ind w:left="850"/>
+        <w:ind w:left="454"/>
         <w:shd w:val="clear" w:color="auto" w:fill="F1F5F9"/>
       </w:pPr>
       <w:r>
@@ -1419,24 +1658,36 @@
         <w:t>python cli.py get /demo/archivo_demo.bin /tmp/archivo_descargado.bin</w:t>
       </w:r>
     </w:p>
+    <w:p/>
+    <w:p>
+      <w:pPr>
+        <w:spacing w:after="40"/>
+      </w:pPr>
+    </w:p>
     <w:p>
       <w:pPr>
         <w:spacing w:after="80"/>
         <w:ind w:left="567"/>
+        <w:shd w:val="clear" w:color="auto" w:fill="EFF6FF"/>
       </w:pPr>
       <w:r>
         <w:rPr>
           <w:i/>
-          <w:color w:val="1E40AF"/>
-          <w:sz w:val="22"/>
+          <w:color w:val="1E3A8A"/>
+          <w:sz w:val="21"/>
         </w:rPr>
-        <w:t>"Descarga exitosa. Y verificamos la integridad con SHA-256:"</w:t>
+        <w:t>"Descarga exitosa. Y lo más importante: verificamos la integridad con SHA-256:"</w:t>
       </w:r>
     </w:p>
     <w:p>
       <w:pPr>
+        <w:spacing w:after="40"/>
+      </w:pPr>
+    </w:p>
+    <w:p>
+      <w:pPr>
         <w:spacing w:before="40" w:after="40"/>
-        <w:ind w:left="850"/>
+        <w:ind w:left="454"/>
         <w:shd w:val="clear" w:color="auto" w:fill="F1F5F9"/>
       </w:pPr>
       <w:r>
@@ -1448,75 +1699,440 @@
         <w:t>sha256sum /tmp/archivo_demo.bin /tmp/archivo_descargado.bin</w:t>
       </w:r>
     </w:p>
+    <w:p/>
+    <w:p>
+      <w:pPr>
+        <w:spacing w:after="40"/>
+      </w:pPr>
+    </w:p>
     <w:p>
       <w:pPr>
         <w:spacing w:after="80"/>
         <w:ind w:left="567"/>
+        <w:shd w:val="clear" w:color="auto" w:fill="EFF6FF"/>
       </w:pPr>
       <w:r>
         <w:rPr>
           <w:i/>
-          <w:color w:val="1E40AF"/>
-          <w:sz w:val="22"/>
+          <w:color w:val="1E3A8A"/>
+          <w:sz w:val="21"/>
         </w:rPr>
-        <w:t>"Los dos hashes son identicos. El archivo que descargamos es exactamente igual al que subimos, byte por byte. La integridad esta garantizada."</w:t>
+        <w:t>"Los dos hashes son idénticos. El archivo que descargamos es exactamente igual al que subimos, byte por byte. La integridad está garantizada."</w:t>
       </w:r>
     </w:p>
     <w:p>
+      <w:pPr>
+        <w:spacing w:after="40"/>
+      </w:pPr>
+    </w:p>
+    <w:p>
+      <w:pPr>
+        <w:spacing w:after="40"/>
+      </w:pPr>
+    </w:p>
+    <w:p>
+      <w:pPr>
+        <w:spacing w:after="40"/>
+      </w:pPr>
+    </w:p>
+    <w:p>
+      <w:pPr>
+        <w:pStyle w:val="Heading3"/>
+      </w:pPr>
       <w:r>
-        <w:t>______________________________________________________________________</w:t>
+        <w:rPr>
+          <w:color w:val="6D28D9"/>
+        </w:rPr>
+        <w:t>SEGMENTO 4b – NUEVAS FUNCIONALIDADES (2 min)</w:t>
       </w:r>
     </w:p>
     <w:p>
       <w:pPr>
-        <w:pStyle w:val="Heading1"/>
-        <w:jc w:val="left"/>
+        <w:spacing w:after="80"/>
+        <w:ind w:left="567"/>
+        <w:shd w:val="clear" w:color="auto" w:fill="EFF6FF"/>
       </w:pPr>
       <w:r>
         <w:rPr>
+          <w:i/>
           <w:color w:val="1E3A8A"/>
+          <w:sz w:val="21"/>
         </w:rPr>
-        <w:t>SEGMENTO 5 – Tolerancia a Fallos  (2 minutos)</w:t>
+        <w:t>📺 Pantalla: Terminal del cliente en el NameNode</w:t>
       </w:r>
     </w:p>
     <w:p>
       <w:pPr>
-        <w:ind w:left="283"/>
+        <w:spacing w:after="40"/>
+      </w:pPr>
+    </w:p>
+    <w:p>
+      <w:pPr>
+        <w:spacing w:after="80"/>
       </w:pPr>
       <w:r>
         <w:rPr>
           <w:b/>
-          <w:color w:val="92400E"/>
+          <w:i w:val="0"/>
+          <w:color w:val="0F766E"/>
+          <w:sz w:val="22"/>
+        </w:rPr>
+        <w:t>[Permanecer en la misma terminal del cliente]</w:t>
+      </w:r>
+    </w:p>
+    <w:p>
+      <w:pPr>
+        <w:spacing w:after="40"/>
+      </w:pPr>
+    </w:p>
+    <w:p>
+      <w:pPr>
+        <w:spacing w:after="80"/>
+        <w:ind w:left="567"/>
+        <w:shd w:val="clear" w:color="auto" w:fill="EFF6FF"/>
+      </w:pPr>
+      <w:r>
+        <w:rPr>
+          <w:i/>
+          <w:color w:val="1E3A8A"/>
+          <w:sz w:val="21"/>
+        </w:rPr>
+        <w:t>"Además de las operaciones básicas, implementé dos funcionalidades adicionales que mejoran la observabilidad y usabilidad del sistema."</w:t>
+      </w:r>
+    </w:p>
+    <w:p>
+      <w:pPr>
+        <w:spacing w:after="40"/>
+      </w:pPr>
+    </w:p>
+    <w:p>
+      <w:pPr>
+        <w:spacing w:after="80"/>
+      </w:pPr>
+      <w:r>
+        <w:rPr>
+          <w:b/>
+          <w:i w:val="0"/>
+          <w:color w:val="0F766E"/>
+          <w:sz w:val="22"/>
+        </w:rPr>
+        <w:t>La primera es el comando status:</w:t>
+      </w:r>
+    </w:p>
+    <w:p>
+      <w:pPr>
+        <w:spacing w:after="40"/>
+      </w:pPr>
+    </w:p>
+    <w:p>
+      <w:pPr>
+        <w:spacing w:before="40" w:after="40"/>
+        <w:ind w:left="454"/>
+        <w:shd w:val="clear" w:color="auto" w:fill="F1F5F9"/>
+      </w:pPr>
+      <w:r>
+        <w:rPr>
+          <w:rFonts w:ascii="Courier New" w:hAnsi="Courier New"/>
+          <w:color w:val="1E40AF"/>
           <w:sz w:val="18"/>
         </w:rPr>
-        <w:t>Pantalla: Terminal DataNode 2 + Terminal cliente lado a lado</w:t>
+        <w:t>python3 cli.py status</w:t>
       </w:r>
     </w:p>
     <w:p/>
     <w:p>
       <w:pPr>
+        <w:spacing w:after="40"/>
+      </w:pPr>
+    </w:p>
+    <w:p>
+      <w:pPr>
         <w:spacing w:after="80"/>
         <w:ind w:left="567"/>
+        <w:shd w:val="clear" w:color="auto" w:fill="EFF6FF"/>
       </w:pPr>
       <w:r>
         <w:rPr>
           <w:i/>
-          <w:color w:val="1E40AF"/>
-          <w:sz w:val="22"/>
+          <w:color w:val="1E3A8A"/>
+          <w:sz w:val="21"/>
         </w:rPr>
-        <w:t>"Y ahora la prueba mas importante del proyecto: que pasa si un DataNode se cae?"</w:t>
+        <w:t>"El comando `status` consulta al NameNode mediante el nuevo RPC `GetClusterStatus` y muestra en tiempo real el estado completo del clúster: qué DataNodes están activos o caídos, cuántos bloques tiene almacenados cada uno, el espacio disponible y el timestamp del último heartbeat recibido. Esto nos permite verificar visualmente que los bloques están efectivamente distribuidos entre los tres nodos."</w:t>
       </w:r>
     </w:p>
     <w:p>
       <w:pPr>
-        <w:spacing w:before="60" w:after="60"/>
-        <w:ind w:left="283"/>
+        <w:spacing w:after="40"/>
+      </w:pPr>
+    </w:p>
+    <w:p>
+      <w:pPr>
+        <w:spacing w:after="80"/>
       </w:pPr>
       <w:r>
         <w:rPr>
           <w:b/>
+          <w:i w:val="0"/>
           <w:color w:val="0F766E"/>
-          <w:sz w:val="20"/>
+          <w:sz w:val="22"/>
+        </w:rPr>
+        <w:t>La segunda es rmdir -r para eliminación recursiva:</w:t>
+      </w:r>
+    </w:p>
+    <w:p>
+      <w:pPr>
+        <w:spacing w:after="40"/>
+      </w:pPr>
+    </w:p>
+    <w:p>
+      <w:pPr>
+        <w:spacing w:before="40" w:after="40"/>
+        <w:ind w:left="454"/>
+        <w:shd w:val="clear" w:color="auto" w:fill="F1F5F9"/>
+      </w:pPr>
+      <w:r>
+        <w:rPr>
+          <w:rFonts w:ascii="Courier New" w:hAnsi="Courier New"/>
+          <w:color w:val="1E40AF"/>
+          <w:sz w:val="18"/>
+        </w:rPr>
+        <w:t>python3 cli.py mkdir /demo_rmdir</w:t>
+      </w:r>
+    </w:p>
+    <w:p>
+      <w:pPr>
+        <w:spacing w:before="40" w:after="40"/>
+        <w:ind w:left="454"/>
+        <w:shd w:val="clear" w:color="auto" w:fill="F1F5F9"/>
+      </w:pPr>
+      <w:r>
+        <w:rPr>
+          <w:rFonts w:ascii="Courier New" w:hAnsi="Courier New"/>
+          <w:color w:val="1E40AF"/>
+          <w:sz w:val="18"/>
+        </w:rPr>
+        <w:t>python3 cli.py put /tmp/archivo_video.bin /demo_rmdir/archivo.bin</w:t>
+      </w:r>
+    </w:p>
+    <w:p>
+      <w:pPr>
+        <w:spacing w:before="40" w:after="40"/>
+        <w:ind w:left="454"/>
+        <w:shd w:val="clear" w:color="auto" w:fill="F1F5F9"/>
+      </w:pPr>
+      <w:r>
+        <w:rPr>
+          <w:rFonts w:ascii="Courier New" w:hAnsi="Courier New"/>
+          <w:color w:val="1E40AF"/>
+          <w:sz w:val="18"/>
+        </w:rPr>
+        <w:t>python3 cli.py ls /demo_rmdir</w:t>
+      </w:r>
+    </w:p>
+    <w:p/>
+    <w:p>
+      <w:pPr>
+        <w:spacing w:after="40"/>
+      </w:pPr>
+    </w:p>
+    <w:p>
+      <w:pPr>
+        <w:spacing w:before="40" w:after="40"/>
+        <w:ind w:left="454"/>
+        <w:shd w:val="clear" w:color="auto" w:fill="F1F5F9"/>
+      </w:pPr>
+      <w:r>
+        <w:rPr>
+          <w:rFonts w:ascii="Courier New" w:hAnsi="Courier New"/>
+          <w:color w:val="1E40AF"/>
+          <w:sz w:val="18"/>
+        </w:rPr>
+        <w:t># Intento sin -r (debe fallar con mensaje útil)</w:t>
+      </w:r>
+    </w:p>
+    <w:p>
+      <w:pPr>
+        <w:spacing w:before="40" w:after="40"/>
+        <w:ind w:left="454"/>
+        <w:shd w:val="clear" w:color="auto" w:fill="F1F5F9"/>
+      </w:pPr>
+      <w:r>
+        <w:rPr>
+          <w:rFonts w:ascii="Courier New" w:hAnsi="Courier New"/>
+          <w:color w:val="1E40AF"/>
+          <w:sz w:val="18"/>
+        </w:rPr>
+        <w:t>python3 cli.py rmdir /demo_rmdir</w:t>
+      </w:r>
+    </w:p>
+    <w:p/>
+    <w:p>
+      <w:pPr>
+        <w:spacing w:after="40"/>
+      </w:pPr>
+    </w:p>
+    <w:p>
+      <w:pPr>
+        <w:spacing w:after="80"/>
+        <w:ind w:left="567"/>
+        <w:shd w:val="clear" w:color="auto" w:fill="EFF6FF"/>
+      </w:pPr>
+      <w:r>
+        <w:rPr>
+          <w:i/>
+          <w:color w:val="1E3A8A"/>
+          <w:sz w:val="21"/>
+        </w:rPr>
+        <w:t>"El sistema me protege e incluso me sugiere el comando correcto: `rmdir -r`."</w:t>
+      </w:r>
+    </w:p>
+    <w:p>
+      <w:pPr>
+        <w:spacing w:after="40"/>
+      </w:pPr>
+    </w:p>
+    <w:p>
+      <w:pPr>
+        <w:spacing w:before="40" w:after="40"/>
+        <w:ind w:left="454"/>
+        <w:shd w:val="clear" w:color="auto" w:fill="F1F5F9"/>
+      </w:pPr>
+      <w:r>
+        <w:rPr>
+          <w:rFonts w:ascii="Courier New" w:hAnsi="Courier New"/>
+          <w:color w:val="1E40AF"/>
+          <w:sz w:val="18"/>
+        </w:rPr>
+        <w:t># Eliminación recursiva</w:t>
+      </w:r>
+    </w:p>
+    <w:p>
+      <w:pPr>
+        <w:spacing w:before="40" w:after="40"/>
+        <w:ind w:left="454"/>
+        <w:shd w:val="clear" w:color="auto" w:fill="F1F5F9"/>
+      </w:pPr>
+      <w:r>
+        <w:rPr>
+          <w:rFonts w:ascii="Courier New" w:hAnsi="Courier New"/>
+          <w:color w:val="1E40AF"/>
+          <w:sz w:val="18"/>
+        </w:rPr>
+        <w:t>python3 cli.py rmdir -r /demo_rmdir</w:t>
+      </w:r>
+    </w:p>
+    <w:p>
+      <w:pPr>
+        <w:spacing w:before="40" w:after="40"/>
+        <w:ind w:left="454"/>
+        <w:shd w:val="clear" w:color="auto" w:fill="F1F5F9"/>
+      </w:pPr>
+      <w:r>
+        <w:rPr>
+          <w:rFonts w:ascii="Courier New" w:hAnsi="Courier New"/>
+          <w:color w:val="1E40AF"/>
+          <w:sz w:val="18"/>
+        </w:rPr>
+        <w:t>python3 cli.py ls /</w:t>
+      </w:r>
+    </w:p>
+    <w:p/>
+    <w:p>
+      <w:pPr>
+        <w:spacing w:after="40"/>
+      </w:pPr>
+    </w:p>
+    <w:p>
+      <w:pPr>
+        <w:spacing w:after="80"/>
+        <w:ind w:left="567"/>
+        <w:shd w:val="clear" w:color="auto" w:fill="EFF6FF"/>
+      </w:pPr>
+      <w:r>
+        <w:rPr>
+          <w:i/>
+          <w:color w:val="1E3A8A"/>
+          <w:sz w:val="21"/>
+        </w:rPr>
+        <w:t>"Con la flag `-r` elimina el directorio y todo su contenido en cascada. En este caso 1 archivo fue eliminado junto con el directorio."</w:t>
+      </w:r>
+    </w:p>
+    <w:p>
+      <w:pPr>
+        <w:spacing w:after="40"/>
+      </w:pPr>
+    </w:p>
+    <w:p>
+      <w:pPr>
+        <w:spacing w:after="40"/>
+      </w:pPr>
+    </w:p>
+    <w:p>
+      <w:pPr>
+        <w:spacing w:after="40"/>
+      </w:pPr>
+    </w:p>
+    <w:p>
+      <w:pPr>
+        <w:pStyle w:val="Heading3"/>
+      </w:pPr>
+      <w:r>
+        <w:rPr>
+          <w:color w:val="6D28D9"/>
+        </w:rPr>
+        <w:t>SEGMENTO 5 – TOLERANCIA A FALLOS (2 min)</w:t>
+      </w:r>
+    </w:p>
+    <w:p>
+      <w:pPr>
+        <w:spacing w:after="80"/>
+        <w:ind w:left="567"/>
+        <w:shd w:val="clear" w:color="auto" w:fill="EFF6FF"/>
+      </w:pPr>
+      <w:r>
+        <w:rPr>
+          <w:i/>
+          <w:color w:val="1E3A8A"/>
+          <w:sz w:val="21"/>
+        </w:rPr>
+        <w:t>📺 Pantalla: Terminal DataNode 2 + Terminal cliente</w:t>
+      </w:r>
+    </w:p>
+    <w:p>
+      <w:pPr>
+        <w:spacing w:after="40"/>
+      </w:pPr>
+    </w:p>
+    <w:p>
+      <w:pPr>
+        <w:spacing w:after="80"/>
+        <w:ind w:left="567"/>
+        <w:shd w:val="clear" w:color="auto" w:fill="EFF6FF"/>
+      </w:pPr>
+      <w:r>
+        <w:rPr>
+          <w:i/>
+          <w:color w:val="1E3A8A"/>
+          <w:sz w:val="21"/>
+        </w:rPr>
+        <w:t>"Y ahora la prueba más importante del proyecto: ¿qué pasa si un DataNode se cae?"</w:t>
+      </w:r>
+    </w:p>
+    <w:p>
+      <w:pPr>
+        <w:spacing w:after="40"/>
+      </w:pPr>
+    </w:p>
+    <w:p>
+      <w:pPr>
+        <w:spacing w:after="80"/>
+      </w:pPr>
+      <w:r>
+        <w:rPr>
+          <w:b/>
+          <w:i w:val="0"/>
+          <w:color w:val="0F766E"/>
+          <w:sz w:val="22"/>
         </w:rPr>
         <w:t>[Ir a terminal del DataNode 2]</w:t>
       </w:r>
@@ -1524,7 +2140,7 @@
     <w:p>
       <w:pPr>
         <w:spacing w:before="40" w:after="40"/>
-        <w:ind w:left="850"/>
+        <w:ind w:left="454"/>
         <w:shd w:val="clear" w:color="auto" w:fill="F1F5F9"/>
       </w:pPr>
       <w:r>
@@ -1536,38 +2152,45 @@
         <w:t>docker compose down</w:t>
       </w:r>
     </w:p>
+    <w:p/>
     <w:p>
       <w:pPr>
         <w:spacing w:after="80"/>
         <w:ind w:left="567"/>
+        <w:shd w:val="clear" w:color="auto" w:fill="EFF6FF"/>
       </w:pPr>
       <w:r>
         <w:rPr>
           <w:i/>
-          <w:color w:val="1E40AF"/>
-          <w:sz w:val="22"/>
+          <w:color w:val="1E3A8A"/>
+          <w:sz w:val="21"/>
         </w:rPr>
-        <w:t>"Acabo de detener el DataNode 2. Ya no esta disponible."</w:t>
+        <w:t>"Acabo de detener el DataNode 2. Ya no está disponible."</w:t>
       </w:r>
     </w:p>
     <w:p>
       <w:pPr>
-        <w:spacing w:before="60" w:after="60"/>
-        <w:ind w:left="283"/>
+        <w:spacing w:after="40"/>
+      </w:pPr>
+    </w:p>
+    <w:p>
+      <w:pPr>
+        <w:spacing w:after="80"/>
       </w:pPr>
       <w:r>
         <w:rPr>
           <w:b/>
+          <w:i w:val="0"/>
           <w:color w:val="0F766E"/>
-          <w:sz w:val="20"/>
+          <w:sz w:val="22"/>
         </w:rPr>
-        <w:t>[Esperar ~5 segundos, ir a logs del NameNode]</w:t>
+        <w:t>[Esperar 5 segundos, ir a logs del NameNode]</w:t>
       </w:r>
     </w:p>
     <w:p>
       <w:pPr>
         <w:spacing w:before="40" w:after="40"/>
-        <w:ind w:left="850"/>
+        <w:ind w:left="454"/>
         <w:shd w:val="clear" w:color="auto" w:fill="F1F5F9"/>
       </w:pPr>
       <w:r>
@@ -1579,38 +2202,45 @@
         <w:t>docker logs minidfs-namenode --tail 10</w:t>
       </w:r>
     </w:p>
+    <w:p/>
     <w:p>
       <w:pPr>
         <w:spacing w:after="80"/>
         <w:ind w:left="567"/>
+        <w:shd w:val="clear" w:color="auto" w:fill="EFF6FF"/>
       </w:pPr>
       <w:r>
         <w:rPr>
           <w:i/>
-          <w:color w:val="1E40AF"/>
-          <w:sz w:val="22"/>
+          <w:color w:val="1E3A8A"/>
+          <w:sz w:val="21"/>
         </w:rPr>
-        <w:t>"El HeartbeatMonitor detectara en menos de 30 segundos que dn2 dejo de responder y marcara el nodo como inactivo."</w:t>
+        <w:t>"El HeartbeatMonitor detectará en menos de 30 segundos que dn2 dejó de responder y marcará el nodo como inactivo. Vean cómo aparece el mensaje de nodo caído."</w:t>
       </w:r>
     </w:p>
     <w:p>
       <w:pPr>
-        <w:spacing w:before="60" w:after="60"/>
-        <w:ind w:left="283"/>
+        <w:spacing w:after="40"/>
+      </w:pPr>
+    </w:p>
+    <w:p>
+      <w:pPr>
+        <w:spacing w:after="80"/>
       </w:pPr>
       <w:r>
         <w:rPr>
           <w:b/>
+          <w:i w:val="0"/>
           <w:color w:val="0F766E"/>
-          <w:sz w:val="20"/>
+          <w:sz w:val="22"/>
         </w:rPr>
-        <w:t>[Ir a terminal del cliente, intentar descarga]</w:t>
+        <w:t>[Ir a terminal del cliente]</w:t>
       </w:r>
     </w:p>
     <w:p>
       <w:pPr>
         <w:spacing w:before="40" w:after="40"/>
-        <w:ind w:left="850"/>
+        <w:ind w:left="454"/>
         <w:shd w:val="clear" w:color="auto" w:fill="F1F5F9"/>
       </w:pPr>
       <w:r>
@@ -1622,24 +2252,31 @@
         <w:t>python cli.py get /demo/archivo_demo.bin /tmp/archivo_tolerancia.bin</w:t>
       </w:r>
     </w:p>
+    <w:p/>
     <w:p>
       <w:pPr>
         <w:spacing w:after="80"/>
         <w:ind w:left="567"/>
+        <w:shd w:val="clear" w:color="auto" w:fill="EFF6FF"/>
       </w:pPr>
       <w:r>
         <w:rPr>
           <w:i/>
-          <w:color w:val="1E40AF"/>
-          <w:sz w:val="22"/>
+          <w:color w:val="1E3A8A"/>
+          <w:sz w:val="21"/>
         </w:rPr>
-        <w:t>"A pesar de que DataNode 2 esta caido, el sistema descargo el archivo exitosamente usando las replicas en dn1 y dn3. El fallback fue completamente automatico y transparente para el usuario."</w:t>
+        <w:t>"A pesar de que DataNode 2 está caído, el sistema descargó el archivo exitosamente usando las réplicas en dn1 y dn3. El fallback fue completamente automático y transparente para el usuario."</w:t>
       </w:r>
     </w:p>
     <w:p>
       <w:pPr>
+        <w:spacing w:after="40"/>
+      </w:pPr>
+    </w:p>
+    <w:p>
+      <w:pPr>
         <w:spacing w:before="40" w:after="40"/>
-        <w:ind w:left="850"/>
+        <w:ind w:left="454"/>
         <w:shd w:val="clear" w:color="auto" w:fill="F1F5F9"/>
       </w:pPr>
       <w:r>
@@ -1651,175 +2288,245 @@
         <w:t>sha256sum /tmp/archivo_demo.bin /tmp/archivo_tolerancia.bin</w:t>
       </w:r>
     </w:p>
+    <w:p/>
     <w:p>
       <w:pPr>
         <w:spacing w:after="80"/>
         <w:ind w:left="567"/>
+        <w:shd w:val="clear" w:color="auto" w:fill="EFF6FF"/>
       </w:pPr>
       <w:r>
         <w:rPr>
           <w:i/>
-          <w:color w:val="1E40AF"/>
-          <w:sz w:val="22"/>
+          <w:color w:val="1E3A8A"/>
+          <w:sz w:val="21"/>
         </w:rPr>
-        <w:t>"SHA-256 identico. La tolerancia a fallos funciona perfectamente en produccion en AWS."</w:t>
+        <w:t>"SHA-256 idéntico. La tolerancia a fallos funciona perfectamente en producción en AWS."</w:t>
       </w:r>
     </w:p>
     <w:p>
+      <w:pPr>
+        <w:spacing w:after="40"/>
+      </w:pPr>
+    </w:p>
+    <w:p>
+      <w:pPr>
+        <w:spacing w:after="40"/>
+      </w:pPr>
+    </w:p>
+    <w:p>
+      <w:pPr>
+        <w:spacing w:after="40"/>
+      </w:pPr>
+    </w:p>
+    <w:p>
+      <w:pPr>
+        <w:pStyle w:val="Heading3"/>
+      </w:pPr>
       <w:r>
-        <w:t>______________________________________________________________________</w:t>
+        <w:rPr>
+          <w:color w:val="6D28D9"/>
+        </w:rPr>
+        <w:t>SEGMENTO 6 – CIERRE (1 min)</w:t>
       </w:r>
     </w:p>
     <w:p>
       <w:pPr>
-        <w:pStyle w:val="Heading1"/>
-        <w:jc w:val="left"/>
+        <w:spacing w:after="80"/>
+        <w:ind w:left="567"/>
+        <w:shd w:val="clear" w:color="auto" w:fill="EFF6FF"/>
       </w:pPr>
       <w:r>
         <w:rPr>
+          <w:i/>
           <w:color w:val="1E3A8A"/>
+          <w:sz w:val="21"/>
         </w:rPr>
-        <w:t>SEGMENTO 6 – Cierre  (1 minuto)</w:t>
+        <w:t>📺 Pantalla: Cámara frontal + mostrar GitHub brevemente</w:t>
       </w:r>
     </w:p>
     <w:p>
       <w:pPr>
-        <w:ind w:left="283"/>
+        <w:spacing w:after="40"/>
+      </w:pPr>
+    </w:p>
+    <w:p>
+      <w:pPr>
+        <w:spacing w:after="80"/>
       </w:pPr>
       <w:r>
         <w:rPr>
           <w:b/>
-          <w:color w:val="92400E"/>
-          <w:sz w:val="18"/>
+          <w:i w:val="0"/>
+          <w:color w:val="0F766E"/>
+          <w:sz w:val="22"/>
         </w:rPr>
-        <w:t>Pantalla: Mostrar repositorio GitHub brevemente, luego camara frontal</w:t>
-      </w:r>
-    </w:p>
-    <w:p/>
-    <w:p>
-      <w:pPr>
-        <w:spacing w:before="60" w:after="60"/>
-        <w:ind w:left="283"/>
-      </w:pPr>
-      <w:r>
-        <w:rPr>
-          <w:b/>
-          <w:color w:val="0F766E"/>
-          <w:sz w:val="20"/>
-        </w:rPr>
-        <w:t>[Mostrar repositorio GitHub: github.com/Perrpo/Proyecto-DFS-Sistemas-distribuidos]</w:t>
+        <w:t>[Mostrar el repositorio en GitHub]</w:t>
       </w:r>
     </w:p>
     <w:p>
       <w:pPr>
+        <w:spacing w:after="40"/>
+      </w:pPr>
+    </w:p>
+    <w:p>
+      <w:pPr>
         <w:spacing w:after="80"/>
         <w:ind w:left="567"/>
+        <w:shd w:val="clear" w:color="auto" w:fill="EFF6FF"/>
       </w:pPr>
       <w:r>
         <w:rPr>
           <w:i/>
-          <w:color w:val="1E40AF"/>
-          <w:sz w:val="22"/>
+          <w:color w:val="1E3A8A"/>
+          <w:sz w:val="21"/>
         </w:rPr>
-        <w:t>"Para cerrar, todo el codigo fuente esta disponible en GitHub. El proyecto incluye:"</w:t>
+        <w:t>"Para cerrar, todo el código fuente está disponible en GitHub en el repositorio Proyecto-DFS-Sistemas-distribuidos. El proyecto incluye:"</w:t>
       </w:r>
     </w:p>
     <w:p>
       <w:pPr>
-        <w:pStyle w:val="ListBullet"/>
+        <w:spacing w:after="40"/>
+      </w:pPr>
+    </w:p>
+    <w:p>
+      <w:pPr>
+        <w:spacing w:after="80"/>
         <w:ind w:left="567"/>
+        <w:shd w:val="clear" w:color="auto" w:fill="EFF6FF"/>
       </w:pPr>
       <w:r>
         <w:rPr>
           <w:i/>
-          <w:color w:val="1E40AF"/>
+          <w:color w:val="1E3A8A"/>
+          <w:sz w:val="21"/>
         </w:rPr>
-        <w:t>Un NameNode con autenticacion JWT, gestion de metadatos en SQLite y monitoreo activo de nodos.</w:t>
+        <w:t>"• Un NameNode con autenticación JWT, gestión de metadatos en SQLite, y monitoreo activo de nodos."</w:t>
       </w:r>
     </w:p>
     <w:p>
       <w:pPr>
-        <w:pStyle w:val="ListBullet"/>
+        <w:spacing w:after="80"/>
         <w:ind w:left="567"/>
+        <w:shd w:val="clear" w:color="auto" w:fill="EFF6FF"/>
       </w:pPr>
       <w:r>
         <w:rPr>
           <w:i/>
-          <w:color w:val="1E40AF"/>
+          <w:color w:val="1E3A8A"/>
+          <w:sz w:val="21"/>
         </w:rPr>
-        <w:t>Tres DataNodes con almacenamiento en disco, verificacion SHA-256 y replicacion pipeline.</w:t>
+        <w:t>"• Tres DataNodes con almacenamiento en disco, verificación SHA-256 y replicación pipeline."</w:t>
       </w:r>
     </w:p>
     <w:p>
       <w:pPr>
-        <w:pStyle w:val="ListBullet"/>
+        <w:spacing w:after="80"/>
         <w:ind w:left="567"/>
+        <w:shd w:val="clear" w:color="auto" w:fill="EFF6FF"/>
       </w:pPr>
       <w:r>
         <w:rPr>
           <w:i/>
-          <w:color w:val="1E40AF"/>
+          <w:color w:val="1E3A8A"/>
+          <w:sz w:val="21"/>
         </w:rPr>
-        <w:t>Una CLI completa con put, get, ls, mkdir, rmdir y rm.</w:t>
+        <w:t>"• Una CLI completa con put, get, ls, mkdir, rmdir y rm."</w:t>
       </w:r>
     </w:p>
     <w:p>
       <w:pPr>
-        <w:pStyle w:val="ListBullet"/>
+        <w:spacing w:after="80"/>
         <w:ind w:left="567"/>
+        <w:shd w:val="clear" w:color="auto" w:fill="EFF6FF"/>
       </w:pPr>
       <w:r>
         <w:rPr>
           <w:i/>
-          <w:color w:val="1E40AF"/>
+          <w:color w:val="1E3A8A"/>
+          <w:sz w:val="21"/>
         </w:rPr>
-        <w:t>Todo empaquetado en Docker y desplegado en 4 instancias EC2 reales en AWS.</w:t>
+        <w:t>"• Todo empaquetado en Docker y desplegado en 4 instancias EC2 reales en AWS."</w:t>
       </w:r>
     </w:p>
     <w:p>
       <w:pPr>
+        <w:spacing w:after="40"/>
+      </w:pPr>
+    </w:p>
+    <w:p>
+      <w:pPr>
         <w:spacing w:after="80"/>
         <w:ind w:left="567"/>
+        <w:shd w:val="clear" w:color="auto" w:fill="EFF6FF"/>
       </w:pPr>
       <w:r>
         <w:rPr>
           <w:i/>
-          <w:color w:val="1E40AF"/>
-          <w:sz w:val="22"/>
+          <w:color w:val="1E3A8A"/>
+          <w:sz w:val="21"/>
         </w:rPr>
-        <w:t>"Este proyecto me permitio entender en profundidad como funcionan sistemas como HDFS y GFS: la separacion entre plano de control y plano de datos, la replicacion como mecanismo de tolerancia, y el valor de la verificacion de integridad en sistemas distribuidos."</w:t>
+        <w:t>"Este proyecto me permitió entender en profundidad cómo funcionan sistemas como HDFS y GFS: la separación entre plano de control y plano de datos, la replicación como mecanismo de tolerancia, y el valor de la verificación de integridad en sistemas distribuidos.</w:t>
       </w:r>
     </w:p>
     <w:p>
       <w:pPr>
         <w:spacing w:after="80"/>
+      </w:pPr>
+      <w:r>
+        <w:rPr>
+          <w:b w:val="0"/>
+          <w:i w:val="0"/>
+          <w:sz w:val="22"/>
+        </w:rPr>
+        <w:t>&gt;</w:t>
+      </w:r>
+    </w:p>
+    <w:p>
+      <w:pPr>
+        <w:spacing w:after="80"/>
         <w:ind w:left="567"/>
+        <w:shd w:val="clear" w:color="auto" w:fill="EFF6FF"/>
       </w:pPr>
       <w:r>
         <w:rPr>
           <w:i/>
-          <w:color w:val="1E40AF"/>
-          <w:sz w:val="22"/>
+          <w:color w:val="1E3A8A"/>
+          <w:sz w:val="21"/>
         </w:rPr>
-        <w:t>"Muchas gracias."</w:t>
+        <w:t>Muchas gracias."</w:t>
       </w:r>
     </w:p>
     <w:p>
-      <w:r>
-        <w:br w:type="page"/>
-      </w:r>
+      <w:pPr>
+        <w:spacing w:after="40"/>
+      </w:pPr>
     </w:p>
     <w:p>
       <w:pPr>
-        <w:pStyle w:val="Heading1"/>
-        <w:jc w:val="left"/>
+        <w:spacing w:after="40"/>
+      </w:pPr>
+    </w:p>
+    <w:p>
+      <w:pPr>
+        <w:spacing w:after="40"/>
+      </w:pPr>
+    </w:p>
+    <w:p>
+      <w:pPr>
+        <w:pStyle w:val="Heading2"/>
       </w:pPr>
       <w:r>
         <w:rPr>
           <w:color w:val="0F766E"/>
         </w:rPr>
-        <w:t>Consejos de Grabacion</w:t>
+        <w:t>🎥 CONSEJOS DE GRABACIÓN</w:t>
       </w:r>
+    </w:p>
+    <w:p>
+      <w:pPr>
+        <w:spacing w:after="40"/>
+      </w:pPr>
     </w:p>
     <w:tbl>
       <w:tblPr>
@@ -1828,35 +2535,31 @@
         <w:tblLook w:firstColumn="1" w:firstRow="1" w:lastColumn="0" w:lastRow="0" w:noHBand="0" w:noVBand="1" w:val="04A0"/>
       </w:tblPr>
       <w:tblGrid>
-        <w:gridCol w:w="4561"/>
-        <w:gridCol w:w="4561"/>
+        <w:gridCol w:w="4703"/>
+        <w:gridCol w:w="4703"/>
       </w:tblGrid>
       <w:tr>
         <w:tc>
           <w:tcPr>
-            <w:tcW w:type="dxa" w:w="4561"/>
-            <w:shd w:val="clear" w:color="auto" w:fill="0F766E"/>
+            <w:tcW w:type="dxa" w:w="4703"/>
           </w:tcPr>
           <w:p>
             <w:r>
               <w:rPr>
                 <w:b/>
-                <w:color w:val="FFFFFF"/>
               </w:rPr>
-              <w:t>Consejo</w:t>
+              <w:t>Tip</w:t>
             </w:r>
           </w:p>
         </w:tc>
         <w:tc>
           <w:tcPr>
-            <w:tcW w:type="dxa" w:w="4561"/>
-            <w:shd w:val="clear" w:color="auto" w:fill="0F766E"/>
+            <w:tcW w:type="dxa" w:w="4703"/>
           </w:tcPr>
           <w:p>
             <w:r>
               <w:rPr>
                 <w:b/>
-                <w:color w:val="FFFFFF"/>
               </w:rPr>
               <w:t>Detalle</w:t>
             </w:r>
@@ -1866,21 +2569,21 @@
       <w:tr>
         <w:tc>
           <w:tcPr>
-            <w:tcW w:type="dxa" w:w="4561"/>
+            <w:tcW w:type="dxa" w:w="4703"/>
           </w:tcPr>
           <w:p>
             <w:r>
-              <w:t>Herramienta</w:t>
+              <w:t>**Herramienta**</w:t>
             </w:r>
           </w:p>
         </w:tc>
         <w:tc>
           <w:tcPr>
-            <w:tcW w:type="dxa" w:w="4561"/>
+            <w:tcW w:type="dxa" w:w="4703"/>
           </w:tcPr>
           <w:p>
             <w:r>
-              <w:t>OBS Studio (gratis) o grabacion de pantalla de Windows (Win+G)</w:t>
+              <w:t>OBS Studio (gratis) o simplemente la grabación de pantalla de Windows (Win+G)</w:t>
             </w:r>
           </w:p>
         </w:tc>
@@ -1888,17 +2591,17 @@
       <w:tr>
         <w:tc>
           <w:tcPr>
-            <w:tcW w:type="dxa" w:w="4561"/>
+            <w:tcW w:type="dxa" w:w="4703"/>
           </w:tcPr>
           <w:p>
             <w:r>
-              <w:t>Prepara antes</w:t>
+              <w:t>**Organiza antes**</w:t>
             </w:r>
           </w:p>
         </w:tc>
         <w:tc>
           <w:tcPr>
-            <w:tcW w:type="dxa" w:w="4561"/>
+            <w:tcW w:type="dxa" w:w="4703"/>
           </w:tcPr>
           <w:p>
             <w:r>
@@ -1910,21 +2613,21 @@
       <w:tr>
         <w:tc>
           <w:tcPr>
-            <w:tcW w:type="dxa" w:w="4561"/>
+            <w:tcW w:type="dxa" w:w="4703"/>
           </w:tcPr>
           <w:p>
             <w:r>
-              <w:t>Activa el venv</w:t>
+              <w:t>**Activa el venv**</w:t>
             </w:r>
           </w:p>
         </w:tc>
         <w:tc>
           <w:tcPr>
-            <w:tcW w:type="dxa" w:w="4561"/>
+            <w:tcW w:type="dxa" w:w="4703"/>
           </w:tcPr>
           <w:p>
             <w:r>
-              <w:t>Ejecuta: source ~/venv-dfs/bin/activate en la terminal del cliente</w:t>
+              <w:t>`source ~/venv-dfs/bin/activate` en la terminal del cliente</w:t>
             </w:r>
           </w:p>
         </w:tc>
@@ -1932,21 +2635,21 @@
       <w:tr>
         <w:tc>
           <w:tcPr>
-            <w:tcW w:type="dxa" w:w="4561"/>
+            <w:tcW w:type="dxa" w:w="4703"/>
           </w:tcPr>
           <w:p>
             <w:r>
-              <w:t>Fuente grande</w:t>
+              <w:t>**Fuente grande**</w:t>
             </w:r>
           </w:p>
         </w:tc>
         <w:tc>
           <w:tcPr>
-            <w:tcW w:type="dxa" w:w="4561"/>
+            <w:tcW w:type="dxa" w:w="4703"/>
           </w:tcPr>
           <w:p>
             <w:r>
-              <w:t>Aumenta el tamano de fuente de la terminal a 16-18pt</w:t>
+              <w:t>Aumenta el tamaño de fuente de la terminal a 16-18pt para que se vea bien</w:t>
             </w:r>
           </w:p>
         </w:tc>
@@ -1954,21 +2657,21 @@
       <w:tr>
         <w:tc>
           <w:tcPr>
-            <w:tcW w:type="dxa" w:w="4561"/>
+            <w:tcW w:type="dxa" w:w="4703"/>
           </w:tcPr>
           <w:p>
             <w:r>
-              <w:t>Pausa</w:t>
+              <w:t>**Pausa con intención**</w:t>
             </w:r>
           </w:p>
         </w:tc>
         <w:tc>
           <w:tcPr>
-            <w:tcW w:type="dxa" w:w="4561"/>
+            <w:tcW w:type="dxa" w:w="4703"/>
           </w:tcPr>
           <w:p>
             <w:r>
-              <w:t>Espera 2-3 segundos despues de cada comando para que se vea la salida</w:t>
+              <w:t>Deja 2-3 segundos después de cada comando para que se vea la salida</w:t>
             </w:r>
           </w:p>
         </w:tc>
@@ -1976,21 +2679,21 @@
       <w:tr>
         <w:tc>
           <w:tcPr>
-            <w:tcW w:type="dxa" w:w="4561"/>
+            <w:tcW w:type="dxa" w:w="4703"/>
           </w:tcPr>
           <w:p>
             <w:r>
-              <w:t>Habla despacio</w:t>
+              <w:t>**Habla despacio**</w:t>
             </w:r>
           </w:p>
         </w:tc>
         <w:tc>
           <w:tcPr>
-            <w:tcW w:type="dxa" w:w="4561"/>
+            <w:tcW w:type="dxa" w:w="4703"/>
           </w:tcPr>
           <w:p>
             <w:r>
-              <w:t>Habla un 20% mas lento de lo normal</w:t>
+              <w:t>Habla un 20% más lento de lo normal — en cámara siempre se percibe más rápido</w:t>
             </w:r>
           </w:p>
         </w:tc>
@@ -1998,21 +2701,21 @@
       <w:tr>
         <w:tc>
           <w:tcPr>
-            <w:tcW w:type="dxa" w:w="4561"/>
+            <w:tcW w:type="dxa" w:w="4703"/>
           </w:tcPr>
           <w:p>
             <w:r>
-              <w:t>Sin edicion excesiva</w:t>
+              <w:t>**No edites en exceso**</w:t>
             </w:r>
           </w:p>
         </w:tc>
         <w:tc>
           <w:tcPr>
-            <w:tcW w:type="dxa" w:w="4561"/>
+            <w:tcW w:type="dxa" w:w="4703"/>
           </w:tcPr>
           <w:p>
             <w:r>
-              <w:t>Una toma continua de 12 min es mas profesional que muchos cortes</w:t>
+              <w:t>Una toma continua de 12 min es mejor que muchos cortes — se ve más profesional</w:t>
             </w:r>
           </w:p>
         </w:tc>
@@ -2021,270 +2724,144 @@
     <w:p/>
     <w:p>
       <w:pPr>
+        <w:spacing w:after="40"/>
+      </w:pPr>
+    </w:p>
+    <w:p>
+      <w:pPr>
+        <w:spacing w:after="40"/>
+      </w:pPr>
+    </w:p>
+    <w:p>
+      <w:pPr>
+        <w:spacing w:after="40"/>
+      </w:pPr>
+    </w:p>
+    <w:p>
+      <w:pPr>
         <w:pStyle w:val="Heading2"/>
-        <w:jc w:val="left"/>
       </w:pPr>
       <w:r>
         <w:rPr>
           <w:color w:val="0F766E"/>
         </w:rPr>
-        <w:t>Cronograma de Pantallas</w:t>
+        <w:t>⏱️ CRONOGRAMA DE PANTALLAS</w:t>
       </w:r>
     </w:p>
-    <w:tbl>
-      <w:tblPr>
-        <w:tblStyle w:val="LightShading-Accent1"/>
-        <w:tblW w:type="auto" w:w="0"/>
-        <w:tblLook w:firstColumn="1" w:firstRow="1" w:lastColumn="0" w:lastRow="0" w:noHBand="0" w:noVBand="1" w:val="04A0"/>
-      </w:tblPr>
-      <w:tblGrid>
-        <w:gridCol w:w="3041"/>
-        <w:gridCol w:w="3041"/>
-        <w:gridCol w:w="3041"/>
-      </w:tblGrid>
-      <w:tr>
-        <w:tc>
-          <w:tcPr>
-            <w:tcW w:type="dxa" w:w="3041"/>
-            <w:shd w:val="clear" w:color="auto" w:fill="1E3A8A"/>
-          </w:tcPr>
-          <w:p>
-            <w:r>
-              <w:rPr>
-                <w:b/>
-                <w:color w:val="FFFFFF"/>
-              </w:rPr>
-              <w:t>Tiempo</w:t>
-            </w:r>
-          </w:p>
-        </w:tc>
-        <w:tc>
-          <w:tcPr>
-            <w:tcW w:type="dxa" w:w="3041"/>
-            <w:shd w:val="clear" w:color="auto" w:fill="1E3A8A"/>
-          </w:tcPr>
-          <w:p>
-            <w:r>
-              <w:rPr>
-                <w:b/>
-                <w:color w:val="FFFFFF"/>
-              </w:rPr>
-              <w:t>Pantalla</w:t>
-            </w:r>
-          </w:p>
-        </w:tc>
-        <w:tc>
-          <w:tcPr>
-            <w:tcW w:type="dxa" w:w="3041"/>
-            <w:shd w:val="clear" w:color="auto" w:fill="1E3A8A"/>
-          </w:tcPr>
-          <w:p>
-            <w:r>
-              <w:rPr>
-                <w:b/>
-                <w:color w:val="FFFFFF"/>
-              </w:rPr>
-              <w:t>Contenido</w:t>
-            </w:r>
-          </w:p>
-        </w:tc>
-      </w:tr>
-      <w:tr>
-        <w:tc>
-          <w:tcPr>
-            <w:tcW w:type="dxa" w:w="3041"/>
-          </w:tcPr>
-          <w:p>
-            <w:r>
-              <w:t>00:00 – 01:00</w:t>
-            </w:r>
-          </w:p>
-        </w:tc>
-        <w:tc>
-          <w:tcPr>
-            <w:tcW w:type="dxa" w:w="3041"/>
-          </w:tcPr>
-          <w:p>
-            <w:r>
-              <w:t>Camara frontal</w:t>
-            </w:r>
-          </w:p>
-        </w:tc>
-        <w:tc>
-          <w:tcPr>
-            <w:tcW w:type="dxa" w:w="3041"/>
-          </w:tcPr>
-          <w:p>
-            <w:r>
-              <w:t>Introduccion</w:t>
-            </w:r>
-          </w:p>
-        </w:tc>
-      </w:tr>
-      <w:tr>
-        <w:tc>
-          <w:tcPr>
-            <w:tcW w:type="dxa" w:w="3041"/>
-          </w:tcPr>
-          <w:p>
-            <w:r>
-              <w:t>01:00 – 03:00</w:t>
-            </w:r>
-          </w:p>
-        </w:tc>
-        <w:tc>
-          <w:tcPr>
-            <w:tcW w:type="dxa" w:w="3041"/>
-          </w:tcPr>
-          <w:p>
-            <w:r>
-              <w:t>README / diagramas</w:t>
-            </w:r>
-          </w:p>
-        </w:tc>
-        <w:tc>
-          <w:tcPr>
-            <w:tcW w:type="dxa" w:w="3041"/>
-          </w:tcPr>
-          <w:p>
-            <w:r>
-              <w:t>Arquitectura</w:t>
-            </w:r>
-          </w:p>
-        </w:tc>
-      </w:tr>
-      <w:tr>
-        <w:tc>
-          <w:tcPr>
-            <w:tcW w:type="dxa" w:w="3041"/>
-          </w:tcPr>
-          <w:p>
-            <w:r>
-              <w:t>03:00 – 06:00</w:t>
-            </w:r>
-          </w:p>
-        </w:tc>
-        <w:tc>
-          <w:tcPr>
-            <w:tcW w:type="dxa" w:w="3041"/>
-          </w:tcPr>
-          <w:p>
-            <w:r>
-              <w:t>VS Code</w:t>
-            </w:r>
-          </w:p>
-        </w:tc>
-        <w:tc>
-          <w:tcPr>
-            <w:tcW w:type="dxa" w:w="3041"/>
-          </w:tcPr>
-          <w:p>
-            <w:r>
-              <w:t>Codigo (proto, heartbeat, blockstore, cli)</w:t>
-            </w:r>
-          </w:p>
-        </w:tc>
-      </w:tr>
-      <w:tr>
-        <w:tc>
-          <w:tcPr>
-            <w:tcW w:type="dxa" w:w="3041"/>
-          </w:tcPr>
-          <w:p>
-            <w:r>
-              <w:t>06:00 – 11:00</w:t>
-            </w:r>
-          </w:p>
-        </w:tc>
-        <w:tc>
-          <w:tcPr>
-            <w:tcW w:type="dxa" w:w="3041"/>
-          </w:tcPr>
-          <w:p>
-            <w:r>
-              <w:t>Terminales SSH</w:t>
-            </w:r>
-          </w:p>
-        </w:tc>
-        <w:tc>
-          <w:tcPr>
-            <w:tcW w:type="dxa" w:w="3041"/>
-          </w:tcPr>
-          <w:p>
-            <w:r>
-              <w:t>Demo en vivo en AWS</w:t>
-            </w:r>
-          </w:p>
-        </w:tc>
-      </w:tr>
-      <w:tr>
-        <w:tc>
-          <w:tcPr>
-            <w:tcW w:type="dxa" w:w="3041"/>
-          </w:tcPr>
-          <w:p>
-            <w:r>
-              <w:t>11:00 – 13:00</w:t>
-            </w:r>
-          </w:p>
-        </w:tc>
-        <w:tc>
-          <w:tcPr>
-            <w:tcW w:type="dxa" w:w="3041"/>
-          </w:tcPr>
-          <w:p>
-            <w:r>
-              <w:t>Terminales SSH</w:t>
-            </w:r>
-          </w:p>
-        </w:tc>
-        <w:tc>
-          <w:tcPr>
-            <w:tcW w:type="dxa" w:w="3041"/>
-          </w:tcPr>
-          <w:p>
-            <w:r>
-              <w:t>Tolerancia a fallos</w:t>
-            </w:r>
-          </w:p>
-        </w:tc>
-      </w:tr>
-      <w:tr>
-        <w:tc>
-          <w:tcPr>
-            <w:tcW w:type="dxa" w:w="3041"/>
-          </w:tcPr>
-          <w:p>
-            <w:r>
-              <w:t>13:00 – 14:00</w:t>
-            </w:r>
-          </w:p>
-        </w:tc>
-        <w:tc>
-          <w:tcPr>
-            <w:tcW w:type="dxa" w:w="3041"/>
-          </w:tcPr>
-          <w:p>
-            <w:r>
-              <w:t>GitHub + camara</w:t>
-            </w:r>
-          </w:p>
-        </w:tc>
-        <w:tc>
-          <w:tcPr>
-            <w:tcW w:type="dxa" w:w="3041"/>
-          </w:tcPr>
-          <w:p>
-            <w:r>
-              <w:t>Cierre y conclusiones</w:t>
-            </w:r>
-          </w:p>
-        </w:tc>
-      </w:tr>
-    </w:tbl>
+    <w:p>
+      <w:pPr>
+        <w:spacing w:after="40"/>
+      </w:pPr>
+    </w:p>
+    <w:p>
+      <w:pPr>
+        <w:spacing w:before="40" w:after="40"/>
+        <w:ind w:left="454"/>
+        <w:shd w:val="clear" w:color="auto" w:fill="F1F5F9"/>
+      </w:pPr>
+      <w:r>
+        <w:rPr>
+          <w:rFonts w:ascii="Courier New" w:hAnsi="Courier New"/>
+          <w:color w:val="1E40AF"/>
+          <w:sz w:val="18"/>
+        </w:rPr>
+        <w:t>00:00 - 01:00  → Cámara frontal (introducción)</w:t>
+      </w:r>
+    </w:p>
+    <w:p>
+      <w:pPr>
+        <w:spacing w:before="40" w:after="40"/>
+        <w:ind w:left="454"/>
+        <w:shd w:val="clear" w:color="auto" w:fill="F1F5F9"/>
+      </w:pPr>
+      <w:r>
+        <w:rPr>
+          <w:rFonts w:ascii="Courier New" w:hAnsi="Courier New"/>
+          <w:color w:val="1E40AF"/>
+          <w:sz w:val="18"/>
+        </w:rPr>
+        <w:t>01:00 - 03:00  → README / diagrama de arquitectura</w:t>
+      </w:r>
+    </w:p>
+    <w:p>
+      <w:pPr>
+        <w:spacing w:before="40" w:after="40"/>
+        <w:ind w:left="454"/>
+        <w:shd w:val="clear" w:color="auto" w:fill="F1F5F9"/>
+      </w:pPr>
+      <w:r>
+        <w:rPr>
+          <w:rFonts w:ascii="Courier New" w:hAnsi="Courier New"/>
+          <w:color w:val="1E40AF"/>
+          <w:sz w:val="18"/>
+        </w:rPr>
+        <w:t>03:00 - 06:00  → VS Code (código: proto, heartbeat, blockstore, cli)</w:t>
+      </w:r>
+    </w:p>
+    <w:p>
+      <w:pPr>
+        <w:spacing w:before="40" w:after="40"/>
+        <w:ind w:left="454"/>
+        <w:shd w:val="clear" w:color="auto" w:fill="F1F5F9"/>
+      </w:pPr>
+      <w:r>
+        <w:rPr>
+          <w:rFonts w:ascii="Courier New" w:hAnsi="Courier New"/>
+          <w:color w:val="1E40AF"/>
+          <w:sz w:val="18"/>
+        </w:rPr>
+        <w:t>06:00 - 11:00  → Terminales SSH (demo en vivo AWS: put, get, sha256)</w:t>
+      </w:r>
+    </w:p>
+    <w:p>
+      <w:pPr>
+        <w:spacing w:before="40" w:after="40"/>
+        <w:ind w:left="454"/>
+        <w:shd w:val="clear" w:color="auto" w:fill="F1F5F9"/>
+      </w:pPr>
+      <w:r>
+        <w:rPr>
+          <w:rFonts w:ascii="Courier New" w:hAnsi="Courier New"/>
+          <w:color w:val="1E40AF"/>
+          <w:sz w:val="18"/>
+        </w:rPr>
+        <w:t>11:00 - 13:00  → Terminal cliente (status + rmdir -r)</w:t>
+      </w:r>
+    </w:p>
+    <w:p>
+      <w:pPr>
+        <w:spacing w:before="40" w:after="40"/>
+        <w:ind w:left="454"/>
+        <w:shd w:val="clear" w:color="auto" w:fill="F1F5F9"/>
+      </w:pPr>
+      <w:r>
+        <w:rPr>
+          <w:rFonts w:ascii="Courier New" w:hAnsi="Courier New"/>
+          <w:color w:val="1E40AF"/>
+          <w:sz w:val="18"/>
+        </w:rPr>
+        <w:t>13:00 - 15:00  → Terminales SSH (tolerancia a fallos)</w:t>
+      </w:r>
+    </w:p>
+    <w:p>
+      <w:pPr>
+        <w:spacing w:before="40" w:after="40"/>
+        <w:ind w:left="454"/>
+        <w:shd w:val="clear" w:color="auto" w:fill="F1F5F9"/>
+      </w:pPr>
+      <w:r>
+        <w:rPr>
+          <w:rFonts w:ascii="Courier New" w:hAnsi="Courier New"/>
+          <w:color w:val="1E40AF"/>
+          <w:sz w:val="18"/>
+        </w:rPr>
+        <w:t>15:00 - 16:00  → GitHub + cámara frontal (cierre)</w:t>
+      </w:r>
+    </w:p>
+    <w:p/>
     <w:sectPr>
       <w:pgSz w:w="12240" w:h="15840"/>
-      <w:pgMar w:top="1417" w:right="1417" w:bottom="1417" w:left="1701" w:header="720" w:footer="720" w:gutter="0"/>
+      <w:pgMar w:top="1134" w:right="1417" w:bottom="1134" w:left="1417" w:header="720" w:footer="720" w:gutter="0"/>
       <w:cols w:space="720"/>
       <w:docGrid w:linePitch="360"/>
     </w:sectPr>
@@ -2655,10 +3232,6 @@
     <w:name w:val="Normal"/>
     <w:qFormat/>
     <w:rsid w:val="00FC693F"/>
-    <w:rPr>
-      <w:rFonts w:ascii="Calibri" w:hAnsi="Calibri"/>
-      <w:sz w:val="22"/>
-    </w:rPr>
   </w:style>
   <w:style w:type="paragraph" w:styleId="Header">
     <w:name w:val="header"/>

</xml_diff>

<commit_message>
docs: guion final con python3, segmento 4b y GitHub Projects
</commit_message>
<xml_diff>
--- a/Guion_Video_Demo.docx
+++ b/Guion_Video_Demo.docx
@@ -4,13 +4,14 @@
   <w:body>
     <w:p>
       <w:pPr>
-        <w:pStyle w:val="Heading1"/>
+        <w:spacing w:after="80"/>
       </w:pPr>
       <w:r>
         <w:rPr>
-          <w:color w:val="1E3A8A"/>
+          <w:b w:val="0"/>
+          <w:sz w:val="22"/>
         </w:rPr>
-        <w:t>🎬 Guión – Video Demostración MiniDFS</w:t>
+        <w:t>﻿# ðŸŽ¬ GuiÃ³n â€“ Video DemostraciÃ³n MiniDFS</w:t>
       </w:r>
     </w:p>
     <w:p>
@@ -21,7 +22,7 @@
         <w:rPr>
           <w:color w:val="0F766E"/>
         </w:rPr>
-        <w:t>Duración objetivo: 12–15 minutos | Solo presentador: Andrés Núñez</w:t>
+        <w:t>DuraciÃ³n objetivo: 12â€“15 minutos | Solo presentador: AndrÃ©s NÃºÃ±ez</w:t>
       </w:r>
     </w:p>
     <w:p>
@@ -47,7 +48,7 @@
         <w:rPr>
           <w:color w:val="0F766E"/>
         </w:rPr>
-        <w:t>📋 ESTRUCTURA GENERAL</w:t>
+        <w:t>ðŸ“‹ ESTRUCTURA GENERAL</w:t>
       </w:r>
     </w:p>
     <w:p>
@@ -124,7 +125,7 @@
           </w:tcPr>
           <w:p>
             <w:r>
-              <w:t>Introducción y presentación</w:t>
+              <w:t>IntroducciÃ³n y presentaciÃ³n</w:t>
             </w:r>
           </w:p>
         </w:tc>
@@ -188,7 +189,7 @@
           </w:tcPr>
           <w:p>
             <w:r>
-              <w:t>Recorrido por el código</w:t>
+              <w:t>Recorrido por el cÃ³digo</w:t>
             </w:r>
           </w:p>
         </w:tc>
@@ -220,7 +221,7 @@
           </w:tcPr>
           <w:p>
             <w:r>
-              <w:t>Demo en vivo – AWS EC2 (put, get, sha256)</w:t>
+              <w:t>Demo en vivo â€“ AWS EC2 (put, get, sha256)</w:t>
             </w:r>
           </w:p>
         </w:tc>
@@ -356,7 +357,7 @@
         <w:rPr>
           <w:color w:val="0F766E"/>
         </w:rPr>
-        <w:t>🎙️ GUIÓN COMPLETO</w:t>
+        <w:t>ðŸŽ™ï¸ GUIÃ“N COMPLETO</w:t>
       </w:r>
     </w:p>
     <w:p>
@@ -382,7 +383,7 @@
         <w:rPr>
           <w:color w:val="6D28D9"/>
         </w:rPr>
-        <w:t>SEGMENTO 1 – INTRODUCCIÓN (1 min)</w:t>
+        <w:t>SEGMENTO 1 â€“ INTRODUCCIÃ“N (1 min)</w:t>
       </w:r>
     </w:p>
     <w:p>
@@ -397,7 +398,7 @@
           <w:color w:val="1E3A8A"/>
           <w:sz w:val="21"/>
         </w:rPr>
-        <w:t>📺 Pantalla: Cámara frontal + diapositiva con el nombre del proyecto</w:t>
+        <w:t>ðŸ“º Pantalla: CÃ¡mara frontal + diapositiva con el nombre del proyecto</w:t>
       </w:r>
     </w:p>
     <w:p>
@@ -412,11 +413,9 @@
       <w:r>
         <w:rPr>
           <w:b/>
-          <w:i w:val="0"/>
-          <w:color w:val="0F766E"/>
           <w:sz w:val="22"/>
         </w:rPr>
-        <w:t>[Hablar mirando a cámara]</w:t>
+        <w:t>[Hablar mirando a cÃ¡mara]</w:t>
       </w:r>
     </w:p>
     <w:p>
@@ -436,7 +435,7 @@
           <w:color w:val="1E3A8A"/>
           <w:sz w:val="21"/>
         </w:rPr>
-        <w:t>"Hola, soy Andrés Núñez, estudiante de Ingeniería de Sistemas de la Universidad Pontificia Bolivariana. En este video voy a presentar MiniDFS, un Sistema de Archivos Distribuidos por Bloques que desarrollé para la materia de Arquitecturas de Nube y Sistemas Distribuidos.</w:t>
+        <w:t>"Hola, soy AndrÃ©s NÃºÃ±ez, estudiante de IngenierÃ­a de Sistemas de la Universidad Pontificia Bolivariana. En este video voy a presentar MiniDFS, un Sistema de Archivos Distribuidos por Bloques que desarrollÃ© para la materia de Arquitecturas de Nube y Sistemas Distribuidos.</w:t>
       </w:r>
     </w:p>
     <w:p>
@@ -446,7 +445,6 @@
       <w:r>
         <w:rPr>
           <w:b w:val="0"/>
-          <w:i w:val="0"/>
           <w:sz w:val="22"/>
         </w:rPr>
         <w:t>&gt;</w:t>
@@ -464,7 +462,7 @@
           <w:color w:val="1E3A8A"/>
           <w:sz w:val="21"/>
         </w:rPr>
-        <w:t>MiniDFS es una implementación minimalista inspirada en HDFS, el sistema de archivos de Hadoop, y en GFS, el sistema de archivos de Google. El objetivo es almacenar archivos grandes de forma distribuida entre múltiples nodos, con replicación automática y tolerancia a fallos.</w:t>
+        <w:t>MiniDFS es una implementaciÃ³n minimalista inspirada en HDFS, el sistema de archivos de Hadoop, y en GFS, el sistema de archivos de Google. El objetivo es almacenar archivos grandes de forma distribuida entre mÃºltiples nodos, con replicaciÃ³n automÃ¡tica y tolerancia a fallos.</w:t>
       </w:r>
     </w:p>
     <w:p>
@@ -474,7 +472,6 @@
       <w:r>
         <w:rPr>
           <w:b w:val="0"/>
-          <w:i w:val="0"/>
           <w:sz w:val="22"/>
         </w:rPr>
         <w:t>&gt;</w:t>
@@ -492,7 +489,7 @@
           <w:color w:val="1E3A8A"/>
           <w:sz w:val="21"/>
         </w:rPr>
-        <w:t>Durante esta demostración voy a mostrarles la arquitectura del sistema, el código implementado, y una ejecución en vivo sobre cuatro instancias de AWS EC2 donde el sistema está corriendo en producción."</w:t>
+        <w:t>Durante esta demostraciÃ³n voy a mostrarles la arquitectura del sistema, el cÃ³digo implementado, y una ejecuciÃ³n en vivo sobre cuatro instancias de AWS EC2 donde el sistema estÃ¡ corriendo en producciÃ³n."</w:t>
       </w:r>
     </w:p>
     <w:p>
@@ -518,7 +515,7 @@
         <w:rPr>
           <w:color w:val="6D28D9"/>
         </w:rPr>
-        <w:t>SEGMENTO 2 – ARQUITECTURA (2 min)</w:t>
+        <w:t>SEGMENTO 2 â€“ ARQUITECTURA (2 min)</w:t>
       </w:r>
     </w:p>
     <w:p>
@@ -533,7 +530,7 @@
           <w:color w:val="1E3A8A"/>
           <w:sz w:val="21"/>
         </w:rPr>
-        <w:t>📺 Pantalla: Compartir pantalla → abrir el README.md o el informe Word con los diagramas</w:t>
+        <w:t>ðŸ“º Pantalla: Compartir pantalla â†’ abrir el README.md o el informe Word con los diagramas</w:t>
       </w:r>
     </w:p>
     <w:p>
@@ -548,11 +545,9 @@
       <w:r>
         <w:rPr>
           <w:b/>
-          <w:i w:val="0"/>
-          <w:color w:val="0F766E"/>
           <w:sz w:val="22"/>
         </w:rPr>
-        <w:t>[Señalar el diagrama de arquitectura]</w:t>
+        <w:t>[SeÃ±alar el diagrama de arquitectura]</w:t>
       </w:r>
     </w:p>
     <w:p>
@@ -572,7 +567,7 @@
           <w:color w:val="1E3A8A"/>
           <w:sz w:val="21"/>
         </w:rPr>
-        <w:t>"La arquitectura sigue el patrón Maestro–Trabajadores. Tenemos tres componentes principales:</w:t>
+        <w:t>"La arquitectura sigue el patrÃ³n Maestroâ€“Trabajadores. Tenemos tres componentes principales:</w:t>
       </w:r>
     </w:p>
     <w:p>
@@ -582,7 +577,6 @@
       <w:r>
         <w:rPr>
           <w:b w:val="0"/>
-          <w:i w:val="0"/>
           <w:sz w:val="22"/>
         </w:rPr>
         <w:t>&gt;</w:t>
@@ -600,7 +594,7 @@
           <w:color w:val="1E3A8A"/>
           <w:sz w:val="21"/>
         </w:rPr>
-        <w:t>Primero, el NameNode: es el cerebro del sistema. Gestiona todos los metadatos, la autenticación de usuarios con tokens JWT, el espacio de nombres de archivos y coordina dónde se almacena cada bloque. Corre en el puerto 50051.</w:t>
+        <w:t>Primero, el NameNode: es el cerebro del sistema. Gestiona todos los metadatos, la autenticaciÃ³n de usuarios con tokens JWT, el espacio de nombres de archivos y coordina dÃ³nde se almacena cada bloque. Corre en el puerto 50051.</w:t>
       </w:r>
     </w:p>
     <w:p>
@@ -610,7 +604,6 @@
       <w:r>
         <w:rPr>
           <w:b w:val="0"/>
-          <w:i w:val="0"/>
           <w:sz w:val="22"/>
         </w:rPr>
         <w:t>&gt;</w:t>
@@ -628,7 +621,7 @@
           <w:color w:val="1E3A8A"/>
           <w:sz w:val="21"/>
         </w:rPr>
-        <w:t>Segundo, los DataNodes: son los trabajadores de almacenamiento. En nuestro caso tenemos tres: dn1, dn2 y dn3, corriendo en los puertos 50061, 50062 y 50063. Cada uno almacena bloques en disco con verificación de integridad SHA-256.</w:t>
+        <w:t>Segundo, los DataNodes: son los trabajadores de almacenamiento. En nuestro caso tenemos tres: dn1, dn2 y dn3, corriendo en los puertos 50061, 50062 y 50063. Cada uno almacena bloques en disco con verificaciÃ³n de integridad SHA-256.</w:t>
       </w:r>
     </w:p>
     <w:p>
@@ -638,7 +631,6 @@
       <w:r>
         <w:rPr>
           <w:b w:val="0"/>
-          <w:i w:val="0"/>
           <w:sz w:val="22"/>
         </w:rPr>
         <w:t>&gt;</w:t>
@@ -656,7 +648,7 @@
           <w:color w:val="1E3A8A"/>
           <w:sz w:val="21"/>
         </w:rPr>
-        <w:t>Tercero, el Cliente: una interfaz de línea de comandos con la que el usuario sube, descarga y gestiona sus archivos.</w:t>
+        <w:t>Tercero, el Cliente: una interfaz de lÃ­nea de comandos con la que el usuario sube, descarga y gestiona sus archivos.</w:t>
       </w:r>
     </w:p>
     <w:p>
@@ -666,7 +658,6 @@
       <w:r>
         <w:rPr>
           <w:b w:val="0"/>
-          <w:i w:val="0"/>
           <w:sz w:val="22"/>
         </w:rPr>
         <w:t>&gt;</w:t>
@@ -684,7 +675,7 @@
           <w:color w:val="1E3A8A"/>
           <w:sz w:val="21"/>
         </w:rPr>
-        <w:t>La comunicación entre todos los componentes se hace mediante gRPC con Protocol Buffers, que es mucho más eficiente que REST para transferencia de datos en streaming.</w:t>
+        <w:t>La comunicaciÃ³n entre todos los componentes se hace mediante gRPC con Protocol Buffers, que es mucho mÃ¡s eficiente que REST para transferencia de datos en streaming.</w:t>
       </w:r>
     </w:p>
     <w:p>
@@ -694,7 +685,6 @@
       <w:r>
         <w:rPr>
           <w:b w:val="0"/>
-          <w:i w:val="0"/>
           <w:sz w:val="22"/>
         </w:rPr>
         <w:t>&gt;</w:t>
@@ -712,7 +702,7 @@
           <w:color w:val="1E3A8A"/>
           <w:sz w:val="21"/>
         </w:rPr>
-        <w:t>[Señalar flecha de replicación pipeline]</w:t>
+        <w:t>[SeÃ±alar flecha de replicaciÃ³n pipeline]</w:t>
       </w:r>
     </w:p>
     <w:p>
@@ -722,7 +712,6 @@
       <w:r>
         <w:rPr>
           <w:b w:val="0"/>
-          <w:i w:val="0"/>
           <w:sz w:val="22"/>
         </w:rPr>
         <w:t>&gt;</w:t>
@@ -740,7 +729,7 @@
           <w:color w:val="1E3A8A"/>
           <w:sz w:val="21"/>
         </w:rPr>
-        <w:t>Un punto clave del diseño es la replicación pipeline: cuando el cliente sube un bloque, lo envía solo al primer DataNode. Ese nodo lo reenvía al segundo, y el segundo al tercero. Así el cliente solo usa su ancho de banda una vez, y los DataNodes se encargan de la replicación entre sí, igual que hace HDFS."</w:t>
+        <w:t>Un punto clave del diseÃ±o es la replicaciÃ³n pipeline: cuando el cliente sube un bloque, lo envÃ­a solo al primer DataNode. Ese nodo lo reenvÃ­a al segundo, y el segundo al tercero. AsÃ­ el cliente solo usa su ancho de banda una vez, y los DataNodes se encargan de la replicaciÃ³n entre sÃ­, igual que hace HDFS."</w:t>
       </w:r>
     </w:p>
     <w:p>
@@ -766,7 +755,7 @@
         <w:rPr>
           <w:color w:val="6D28D9"/>
         </w:rPr>
-        <w:t>SEGMENTO 3 – RECORRIDO POR EL CÓDIGO (3 min)</w:t>
+        <w:t>SEGMENTO 3 â€“ RECORRIDO POR EL CÃ“DIGO (3 min)</w:t>
       </w:r>
     </w:p>
     <w:p>
@@ -781,7 +770,7 @@
           <w:color w:val="1E3A8A"/>
           <w:sz w:val="21"/>
         </w:rPr>
-        <w:t>📺 Pantalla: VS Code con el proyecto abierto</w:t>
+        <w:t>ðŸ“º Pantalla: VS Code con el proyecto abierto</w:t>
       </w:r>
     </w:p>
     <w:p>
@@ -796,8 +785,6 @@
       <w:r>
         <w:rPr>
           <w:b/>
-          <w:i w:val="0"/>
-          <w:color w:val="0F766E"/>
           <w:sz w:val="22"/>
         </w:rPr>
         <w:t>[Abrir VS Code, mostrar la estructura de carpetas]</w:t>
@@ -820,7 +807,7 @@
           <w:color w:val="1E3A8A"/>
           <w:sz w:val="21"/>
         </w:rPr>
-        <w:t>"Veamos rápidamente la estructura del proyecto. Tenemos cuatro carpetas principales.</w:t>
+        <w:t>"Veamos rÃ¡pidamente la estructura del proyecto. Tenemos cuatro carpetas principales.</w:t>
       </w:r>
     </w:p>
     <w:p>
@@ -830,7 +817,6 @@
       <w:r>
         <w:rPr>
           <w:b w:val="0"/>
-          <w:i w:val="0"/>
           <w:sz w:val="22"/>
         </w:rPr>
         <w:t>&gt;</w:t>
@@ -848,7 +834,7 @@
           <w:color w:val="1E3A8A"/>
           <w:sz w:val="21"/>
         </w:rPr>
-        <w:t>En proto/ está el contrato gRPC, el archivo dfs.proto que define todos los servicios y mensajes del sistema. Este es el punto de verdad de toda la comunicación."</w:t>
+        <w:t>En proto/ estÃ¡ el contrato gRPC, el archivo dfs.proto que define todos los servicios y mensajes del sistema. Este es el punto de verdad de toda la comunicaciÃ³n."</w:t>
       </w:r>
     </w:p>
     <w:p>
@@ -863,8 +849,6 @@
       <w:r>
         <w:rPr>
           <w:b/>
-          <w:i w:val="0"/>
-          <w:color w:val="0F766E"/>
           <w:sz w:val="22"/>
         </w:rPr>
         <w:t>[Abrir proto/dfs.proto]</w:t>
@@ -887,7 +871,7 @@
           <w:color w:val="1E3A8A"/>
           <w:sz w:val="21"/>
         </w:rPr>
-        <w:t>"Aquí podemos ver por ejemplo el servicio StoreBlock, que es client-streaming, lo que significa que el cliente envía el bloque en chunks de 4 megabytes. Y RetrieveBlock es server-streaming, el DataNode le envía el bloque al cliente en chunks de 1 megabyte."</w:t>
+        <w:t>"AquÃ­ podemos ver por ejemplo el servicio StoreBlock, que es client-streaming, lo que significa que el cliente envÃ­a el bloque en chunks de 4 megabytes. Y RetrieveBlock es server-streaming, el DataNode le envÃ­a el bloque al cliente en chunks de 1 megabyte."</w:t>
       </w:r>
     </w:p>
     <w:p>
@@ -902,8 +886,6 @@
       <w:r>
         <w:rPr>
           <w:b/>
-          <w:i w:val="0"/>
-          <w:color w:val="0F766E"/>
           <w:sz w:val="22"/>
         </w:rPr>
         <w:t>[Abrir namenode/heartbeat_monitor.py]</w:t>
@@ -926,7 +908,7 @@
           <w:color w:val="1E3A8A"/>
           <w:sz w:val="21"/>
         </w:rPr>
-        <w:t>"En el NameNode, el componente más interesante es el HeartbeatMonitor. Es un thread daemon que corre en segundo plano y monitorea si los DataNodes siguen vivos. Cada DataNode envía un heartbeat cada 10 segundos. Si pasan más de 30 segundos sin heartbeat, el NameNode marca ese nodo como inactivo y automáticamente busca los bloques que quedaron sub-replicados para replicarlos en otros nodos disponibles. Esto es lo que nos da la tolerancia a fallos."</w:t>
+        <w:t>"En el NameNode, el componente mÃ¡s interesante es el HeartbeatMonitor. Es un thread daemon que corre en segundo plano y monitorea si los DataNodes siguen vivos. Cada DataNode envÃ­a un heartbeat cada 10 segundos. Si pasan mÃ¡s de 30 segundos sin heartbeat, el NameNode marca ese nodo como inactivo y automÃ¡ticamente busca los bloques que quedaron sub-replicados para replicarlos en otros nodos disponibles. Esto es lo que nos da la tolerancia a fallos."</w:t>
       </w:r>
     </w:p>
     <w:p>
@@ -941,8 +923,6 @@
       <w:r>
         <w:rPr>
           <w:b/>
-          <w:i w:val="0"/>
-          <w:color w:val="0F766E"/>
           <w:sz w:val="22"/>
         </w:rPr>
         <w:t>[Abrir datanode/block_store.py]</w:t>
@@ -965,7 +945,7 @@
           <w:color w:val="1E3A8A"/>
           <w:sz w:val="21"/>
         </w:rPr>
-        <w:t>"En el DataNode, el BlockStore es donde se almacenan físicamente los bloques en disco. Cada vez que se escribe un bloque, se calcula su SHA-256 y se guarda junto al bloque. Al momento de leer, se vuelve a calcular y se compara. Si no coinciden, el bloque está corrupto y el sistema automáticamente busca una réplica en otro nodo."</w:t>
+        <w:t>"En el DataNode, el BlockStore es donde se almacenan fÃ­sicamente los bloques en disco. Cada vez que se escribe un bloque, se calcula su SHA-256 y se guarda junto al bloque. Al momento de leer, se vuelve a calcular y se compara. Si no coinciden, el bloque estÃ¡ corrupto y el sistema automÃ¡ticamente busca una rÃ©plica en otro nodo."</w:t>
       </w:r>
     </w:p>
     <w:p>
@@ -980,8 +960,6 @@
       <w:r>
         <w:rPr>
           <w:b/>
-          <w:i w:val="0"/>
-          <w:color w:val="0F766E"/>
           <w:sz w:val="22"/>
         </w:rPr>
         <w:t>[Abrir client/cli.py]</w:t>
@@ -1004,7 +982,7 @@
           <w:color w:val="1E3A8A"/>
           <w:sz w:val="21"/>
         </w:rPr>
-        <w:t>"Y finalmente el cliente. La CLI implementa todos los comandos requeridos: put, get, ls, mkdir, rmdir, rm, register y login. La autenticación usa JWT, por lo que el token se persiste localmente y se envía en cada solicitud al NameNode."</w:t>
+        <w:t>"Y finalmente el cliente. La CLI implementa todos los comandos requeridos: put, get, ls, mkdir, rmdir, rm, register y login. La autenticaciÃ³n usa JWT, por lo que el token se persiste localmente y se envÃ­a en cada solicitud al NameNode."</w:t>
       </w:r>
     </w:p>
     <w:p>
@@ -1030,7 +1008,7 @@
         <w:rPr>
           <w:color w:val="6D28D9"/>
         </w:rPr>
-        <w:t>SEGMENTO 4 – DEMO EN VIVO AWS EC2 (5 min)</w:t>
+        <w:t>SEGMENTO 4 â€“ DEMO EN VIVO AWS EC2 (5 min)</w:t>
       </w:r>
     </w:p>
     <w:p>
@@ -1045,7 +1023,7 @@
           <w:color w:val="1E3A8A"/>
           <w:sz w:val="21"/>
         </w:rPr>
-        <w:t>📺 Pantalla: 4 terminales SSH abiertas + PowerShell local</w:t>
+        <w:t>ðŸ“º Pantalla: 4 terminales SSH abiertas + PowerShell local</w:t>
       </w:r>
     </w:p>
     <w:p>
@@ -1060,8 +1038,6 @@
       <w:r>
         <w:rPr>
           <w:b/>
-          <w:i w:val="0"/>
-          <w:color w:val="0F766E"/>
           <w:sz w:val="22"/>
         </w:rPr>
         <w:t>[Mostrar las 4 terminales, cada una conectada a una instancia EC2]</w:t>
@@ -1084,7 +1060,7 @@
           <w:color w:val="1E3A8A"/>
           <w:sz w:val="21"/>
         </w:rPr>
-        <w:t>"Bien, vamos a la parte más importante: la demostración en vivo. Tengo cuatro instancias de AWS EC2 corriendo en us-east-1. En esta terminal está el NameNode con IP privada 172.31.0.165. Y en estas tres están los DataNodes."</w:t>
+        <w:t>"Bien, vamos a la parte mÃ¡s importante: la demostraciÃ³n en vivo. Tengo cuatro instancias de AWS EC2 corriendo en us-east-1. En esta terminal estÃ¡ el NameNode con IP privada 172.31.0.165. Y en estas tres estÃ¡n los DataNodes."</w:t>
       </w:r>
     </w:p>
     <w:p>
@@ -1099,8 +1075,6 @@
       <w:r>
         <w:rPr>
           <w:b/>
-          <w:i w:val="0"/>
-          <w:color w:val="0F766E"/>
           <w:sz w:val="22"/>
         </w:rPr>
         <w:t>[Ir a terminal del NameNode]</w:t>
@@ -1113,7 +1087,7 @@
     </w:p>
     <w:p>
       <w:pPr>
-        <w:spacing w:before="40" w:after="40"/>
+        <w:spacing w:before="20" w:after="20"/>
         <w:ind w:left="454"/>
         <w:shd w:val="clear" w:color="auto" w:fill="F1F5F9"/>
       </w:pPr>
@@ -1139,7 +1113,7 @@
           <w:color w:val="1E3A8A"/>
           <w:sz w:val="21"/>
         </w:rPr>
-        <w:t>"Vemos que el contenedor minidfs-namenode está corriendo y en estado healthy. Puerto 50051 expuesto."</w:t>
+        <w:t>"Vemos que el contenedor minidfs-namenode estÃ¡ corriendo y en estado healthy. Puerto 50051 expuesto."</w:t>
       </w:r>
     </w:p>
     <w:p>
@@ -1154,8 +1128,6 @@
       <w:r>
         <w:rPr>
           <w:b/>
-          <w:i w:val="0"/>
-          <w:color w:val="0F766E"/>
           <w:sz w:val="22"/>
         </w:rPr>
         <w:t>[Ir a terminal DataNode 1]</w:t>
@@ -1163,7 +1135,7 @@
     </w:p>
     <w:p>
       <w:pPr>
-        <w:spacing w:before="40" w:after="40"/>
+        <w:spacing w:before="20" w:after="20"/>
         <w:ind w:left="454"/>
         <w:shd w:val="clear" w:color="auto" w:fill="F1F5F9"/>
       </w:pPr>
@@ -1178,7 +1150,7 @@
     </w:p>
     <w:p>
       <w:pPr>
-        <w:spacing w:before="40" w:after="40"/>
+        <w:spacing w:before="20" w:after="20"/>
         <w:ind w:left="454"/>
         <w:shd w:val="clear" w:color="auto" w:fill="F1F5F9"/>
       </w:pPr>
@@ -1204,7 +1176,7 @@
           <w:color w:val="1E3A8A"/>
           <w:sz w:val="21"/>
         </w:rPr>
-        <w:t>"DataNode 1 está conectado al NameNode en 172.31.0.165 y enviando BlockReports periódicamente."</w:t>
+        <w:t>"DataNode 1 estÃ¡ conectado al NameNode en 172.31.0.165 y enviando BlockReports periÃ³dicamente."</w:t>
       </w:r>
     </w:p>
     <w:p>
@@ -1219,8 +1191,6 @@
       <w:r>
         <w:rPr>
           <w:b/>
-          <w:i w:val="0"/>
-          <w:color w:val="0F766E"/>
           <w:sz w:val="22"/>
         </w:rPr>
         <w:t>[Ir a terminal del NameNode, ver logs]</w:t>
@@ -1228,7 +1198,7 @@
     </w:p>
     <w:p>
       <w:pPr>
-        <w:spacing w:before="40" w:after="40"/>
+        <w:spacing w:before="20" w:after="20"/>
         <w:ind w:left="454"/>
         <w:shd w:val="clear" w:color="auto" w:fill="F1F5F9"/>
       </w:pPr>
@@ -1254,7 +1224,7 @@
           <w:color w:val="1E3A8A"/>
           <w:sz w:val="21"/>
         </w:rPr>
-        <w:t>"Aquí en los logs del NameNode vemos los BlockReports que llegan de dn1, dn2 y dn3. El clúster está completamente operativo."</w:t>
+        <w:t>"AquÃ­ en los logs del NameNode vemos los BlockReports que llegan de dn1, dn2 y dn3. El clÃºster estÃ¡ completamente operativo."</w:t>
       </w:r>
     </w:p>
     <w:p>
@@ -1279,8 +1249,6 @@
       <w:r>
         <w:rPr>
           <w:b/>
-          <w:i w:val="0"/>
-          <w:color w:val="0F766E"/>
           <w:sz w:val="22"/>
         </w:rPr>
         <w:t>[Ir a la terminal con el cliente activo (venv activado)]</w:t>
@@ -1293,7 +1261,7 @@
     </w:p>
     <w:p>
       <w:pPr>
-        <w:spacing w:before="40" w:after="40"/>
+        <w:spacing w:before="20" w:after="20"/>
         <w:ind w:left="454"/>
         <w:shd w:val="clear" w:color="auto" w:fill="F1F5F9"/>
       </w:pPr>
@@ -1308,7 +1276,7 @@
     </w:p>
     <w:p>
       <w:pPr>
-        <w:spacing w:before="40" w:after="40"/>
+        <w:spacing w:before="20" w:after="20"/>
         <w:ind w:left="454"/>
         <w:shd w:val="clear" w:color="auto" w:fill="F1F5F9"/>
       </w:pPr>
@@ -1349,7 +1317,7 @@
     </w:p>
     <w:p>
       <w:pPr>
-        <w:spacing w:before="40" w:after="40"/>
+        <w:spacing w:before="20" w:after="20"/>
         <w:ind w:left="454"/>
         <w:shd w:val="clear" w:color="auto" w:fill="F1F5F9"/>
       </w:pPr>
@@ -1359,12 +1327,12 @@
           <w:color w:val="1E40AF"/>
           <w:sz w:val="18"/>
         </w:rPr>
-        <w:t>python cli.py register andres pass123</w:t>
+        <w:t>python3 cli.py register andres pass123</w:t>
       </w:r>
     </w:p>
     <w:p>
       <w:pPr>
-        <w:spacing w:before="40" w:after="40"/>
+        <w:spacing w:before="20" w:after="20"/>
         <w:ind w:left="454"/>
         <w:shd w:val="clear" w:color="auto" w:fill="F1F5F9"/>
       </w:pPr>
@@ -1374,7 +1342,7 @@
           <w:color w:val="1E40AF"/>
           <w:sz w:val="18"/>
         </w:rPr>
-        <w:t>python cli.py login andres pass123</w:t>
+        <w:t>python3 cli.py login andres pass123</w:t>
       </w:r>
     </w:p>
     <w:p/>
@@ -1390,7 +1358,7 @@
           <w:color w:val="1E3A8A"/>
           <w:sz w:val="21"/>
         </w:rPr>
-        <w:t>"Usuario registrado y autenticado. El NameNode generó un token JWT que el cliente guarda localmente."</w:t>
+        <w:t>"Usuario registrado y autenticado. El NameNode generÃ³ un token JWT que el cliente guarda localmente."</w:t>
       </w:r>
     </w:p>
     <w:p>
@@ -1400,7 +1368,7 @@
     </w:p>
     <w:p>
       <w:pPr>
-        <w:spacing w:before="40" w:after="40"/>
+        <w:spacing w:before="20" w:after="20"/>
         <w:ind w:left="454"/>
         <w:shd w:val="clear" w:color="auto" w:fill="F1F5F9"/>
       </w:pPr>
@@ -1410,7 +1378,7 @@
           <w:color w:val="1E40AF"/>
           <w:sz w:val="18"/>
         </w:rPr>
-        <w:t>python cli.py ls /</w:t>
+        <w:t>python3 cli.py ls /</w:t>
       </w:r>
     </w:p>
     <w:p/>
@@ -1426,7 +1394,7 @@
           <w:color w:val="1E3A8A"/>
           <w:sz w:val="21"/>
         </w:rPr>
-        <w:t>"El sistema de archivos está vacío. Creemos un directorio:"</w:t>
+        <w:t>"El sistema de archivos estÃ¡ vacÃ­o. Creemos un directorio:"</w:t>
       </w:r>
     </w:p>
     <w:p>
@@ -1436,7 +1404,7 @@
     </w:p>
     <w:p>
       <w:pPr>
-        <w:spacing w:before="40" w:after="40"/>
+        <w:spacing w:before="20" w:after="20"/>
         <w:ind w:left="454"/>
         <w:shd w:val="clear" w:color="auto" w:fill="F1F5F9"/>
       </w:pPr>
@@ -1446,12 +1414,12 @@
           <w:color w:val="1E40AF"/>
           <w:sz w:val="18"/>
         </w:rPr>
-        <w:t>python cli.py mkdir /demo</w:t>
+        <w:t>python3 cli.py mkdir /demo</w:t>
       </w:r>
     </w:p>
     <w:p>
       <w:pPr>
-        <w:spacing w:before="40" w:after="40"/>
+        <w:spacing w:before="20" w:after="20"/>
         <w:ind w:left="454"/>
         <w:shd w:val="clear" w:color="auto" w:fill="F1F5F9"/>
       </w:pPr>
@@ -1461,7 +1429,7 @@
           <w:color w:val="1E40AF"/>
           <w:sz w:val="18"/>
         </w:rPr>
-        <w:t>python cli.py ls /</w:t>
+        <w:t>python3 cli.py ls /</w:t>
       </w:r>
     </w:p>
     <w:p/>
@@ -1492,7 +1460,7 @@
           <w:color w:val="1E3A8A"/>
           <w:sz w:val="21"/>
         </w:rPr>
-        <w:t>"Ahora viene la parte más interesante: subir un archivo. Voy a crear un archivo de prueba de 10 megabytes con datos aleatorios:"</w:t>
+        <w:t>"Ahora viene la parte mÃ¡s interesante: subir un archivo. Voy a crear un archivo de prueba de 10 megabytes con datos aleatorios:"</w:t>
       </w:r>
     </w:p>
     <w:p>
@@ -1502,7 +1470,7 @@
     </w:p>
     <w:p>
       <w:pPr>
-        <w:spacing w:before="40" w:after="40"/>
+        <w:spacing w:before="20" w:after="20"/>
         <w:ind w:left="454"/>
         <w:shd w:val="clear" w:color="auto" w:fill="F1F5F9"/>
       </w:pPr>
@@ -1517,7 +1485,7 @@
     </w:p>
     <w:p>
       <w:pPr>
-        <w:spacing w:before="40" w:after="40"/>
+        <w:spacing w:before="20" w:after="20"/>
         <w:ind w:left="454"/>
         <w:shd w:val="clear" w:color="auto" w:fill="F1F5F9"/>
       </w:pPr>
@@ -1538,7 +1506,7 @@
     </w:p>
     <w:p>
       <w:pPr>
-        <w:spacing w:before="40" w:after="40"/>
+        <w:spacing w:before="20" w:after="20"/>
         <w:ind w:left="454"/>
         <w:shd w:val="clear" w:color="auto" w:fill="F1F5F9"/>
       </w:pPr>
@@ -1548,7 +1516,7 @@
           <w:color w:val="1E40AF"/>
           <w:sz w:val="18"/>
         </w:rPr>
-        <w:t>python cli.py put /tmp/archivo_demo.bin /demo/archivo_demo.bin</w:t>
+        <w:t>python3 cli.py put /tmp/archivo_demo.bin /demo/archivo_demo.bin</w:t>
       </w:r>
     </w:p>
     <w:p/>
@@ -1569,7 +1537,7 @@
           <w:color w:val="1E3A8A"/>
           <w:sz w:val="21"/>
         </w:rPr>
-        <w:t>"Observen la salida: el archivo fue dividido en bloques y el bloque fue enviado a un DataNode primario. Vemos el pipeline de replicación: el bloque viajó de dn1 a dn2 a dn3 automáticamente. 1 de 1 bloques confirmados."</w:t>
+        <w:t>"Observen la salida: el archivo fue dividido en bloques y el bloque fue enviado a un DataNode primario. Vemos el pipeline de replicaciÃ³n: el bloque viajÃ³ de dn1 a dn2 a dn3 automÃ¡ticamente. 1 de 1 bloques confirmados."</w:t>
       </w:r>
     </w:p>
     <w:p>
@@ -1579,7 +1547,7 @@
     </w:p>
     <w:p>
       <w:pPr>
-        <w:spacing w:before="40" w:after="40"/>
+        <w:spacing w:before="20" w:after="20"/>
         <w:ind w:left="454"/>
         <w:shd w:val="clear" w:color="auto" w:fill="F1F5F9"/>
       </w:pPr>
@@ -1589,7 +1557,7 @@
           <w:color w:val="1E40AF"/>
           <w:sz w:val="18"/>
         </w:rPr>
-        <w:t>python cli.py ls /demo</w:t>
+        <w:t>python3 cli.py ls /demo</w:t>
       </w:r>
     </w:p>
     <w:p/>
@@ -1605,7 +1573,7 @@
           <w:color w:val="1E3A8A"/>
           <w:sz w:val="21"/>
         </w:rPr>
-        <w:t>"Podemos ver el archivo en el DFS con su tamaño correcto."</w:t>
+        <w:t>"Podemos ver el archivo en el DFS con su tamaÃ±o correcto."</w:t>
       </w:r>
     </w:p>
     <w:p>
@@ -1645,7 +1613,7 @@
     </w:p>
     <w:p>
       <w:pPr>
-        <w:spacing w:before="40" w:after="40"/>
+        <w:spacing w:before="20" w:after="20"/>
         <w:ind w:left="454"/>
         <w:shd w:val="clear" w:color="auto" w:fill="F1F5F9"/>
       </w:pPr>
@@ -1655,7 +1623,7 @@
           <w:color w:val="1E40AF"/>
           <w:sz w:val="18"/>
         </w:rPr>
-        <w:t>python cli.py get /demo/archivo_demo.bin /tmp/archivo_descargado.bin</w:t>
+        <w:t>python3 cli.py get /demo/archivo_demo.bin /tmp/archivo_descargado.bin</w:t>
       </w:r>
     </w:p>
     <w:p/>
@@ -1676,7 +1644,7 @@
           <w:color w:val="1E3A8A"/>
           <w:sz w:val="21"/>
         </w:rPr>
-        <w:t>"Descarga exitosa. Y lo más importante: verificamos la integridad con SHA-256:"</w:t>
+        <w:t>"Descarga exitosa. Y lo mÃ¡s importante: verificamos la integridad con SHA-256:"</w:t>
       </w:r>
     </w:p>
     <w:p>
@@ -1686,7 +1654,7 @@
     </w:p>
     <w:p>
       <w:pPr>
-        <w:spacing w:before="40" w:after="40"/>
+        <w:spacing w:before="20" w:after="20"/>
         <w:ind w:left="454"/>
         <w:shd w:val="clear" w:color="auto" w:fill="F1F5F9"/>
       </w:pPr>
@@ -1717,7 +1685,7 @@
           <w:color w:val="1E3A8A"/>
           <w:sz w:val="21"/>
         </w:rPr>
-        <w:t>"Los dos hashes son idénticos. El archivo que descargamos es exactamente igual al que subimos, byte por byte. La integridad está garantizada."</w:t>
+        <w:t>"Los dos hashes son idÃ©nticos. El archivo que descargamos es exactamente igual al que subimos, byte por byte. La integridad estÃ¡ garantizada."</w:t>
       </w:r>
     </w:p>
     <w:p>
@@ -1743,7 +1711,7 @@
         <w:rPr>
           <w:color w:val="6D28D9"/>
         </w:rPr>
-        <w:t>SEGMENTO 4b – NUEVAS FUNCIONALIDADES (2 min)</w:t>
+        <w:t>SEGMENTO 4b â€“ NUEVAS FUNCIONALIDADES (2 min)</w:t>
       </w:r>
     </w:p>
     <w:p>
@@ -1758,7 +1726,7 @@
           <w:color w:val="1E3A8A"/>
           <w:sz w:val="21"/>
         </w:rPr>
-        <w:t>📺 Pantalla: Terminal del cliente en el NameNode</w:t>
+        <w:t>ðŸ“º Pantalla: Terminal del cliente en el NameNode</w:t>
       </w:r>
     </w:p>
     <w:p>
@@ -1773,8 +1741,6 @@
       <w:r>
         <w:rPr>
           <w:b/>
-          <w:i w:val="0"/>
-          <w:color w:val="0F766E"/>
           <w:sz w:val="22"/>
         </w:rPr>
         <w:t>[Permanecer en la misma terminal del cliente]</w:t>
@@ -1797,7 +1763,7 @@
           <w:color w:val="1E3A8A"/>
           <w:sz w:val="21"/>
         </w:rPr>
-        <w:t>"Además de las operaciones básicas, implementé dos funcionalidades adicionales que mejoran la observabilidad y usabilidad del sistema."</w:t>
+        <w:t>"AdemÃ¡s de las operaciones bÃ¡sicas, implementÃ© dos funcionalidades adicionales que mejoran la observabilidad y usabilidad del sistema."</w:t>
       </w:r>
     </w:p>
     <w:p>
@@ -1812,8 +1778,6 @@
       <w:r>
         <w:rPr>
           <w:b/>
-          <w:i w:val="0"/>
-          <w:color w:val="0F766E"/>
           <w:sz w:val="22"/>
         </w:rPr>
         <w:t>La primera es el comando status:</w:t>
@@ -1826,7 +1790,7 @@
     </w:p>
     <w:p>
       <w:pPr>
-        <w:spacing w:before="40" w:after="40"/>
+        <w:spacing w:before="20" w:after="20"/>
         <w:ind w:left="454"/>
         <w:shd w:val="clear" w:color="auto" w:fill="F1F5F9"/>
       </w:pPr>
@@ -1857,7 +1821,7 @@
           <w:color w:val="1E3A8A"/>
           <w:sz w:val="21"/>
         </w:rPr>
-        <w:t>"El comando `status` consulta al NameNode mediante el nuevo RPC `GetClusterStatus` y muestra en tiempo real el estado completo del clúster: qué DataNodes están activos o caídos, cuántos bloques tiene almacenados cada uno, el espacio disponible y el timestamp del último heartbeat recibido. Esto nos permite verificar visualmente que los bloques están efectivamente distribuidos entre los tres nodos."</w:t>
+        <w:t>"El comando status consulta al NameNode mediante el nuevo RPC GetClusterStatus y muestra en tiempo real el estado completo del clÃºster: quÃ© DataNodes estÃ¡n activos o caÃ­dos, cuÃ¡ntos bloques tiene almacenados cada uno, el espacio disponible y el timestamp del Ãºltimo heartbeat recibido. Esto nos permite verificar visualmente que los bloques estÃ¡n efectivamente distribuidos entre los tres nodos."</w:t>
       </w:r>
     </w:p>
     <w:p>
@@ -1872,11 +1836,9 @@
       <w:r>
         <w:rPr>
           <w:b/>
-          <w:i w:val="0"/>
-          <w:color w:val="0F766E"/>
           <w:sz w:val="22"/>
         </w:rPr>
-        <w:t>La segunda es rmdir -r para eliminación recursiva:</w:t>
+        <w:t>La segunda es rmdir -r para eliminaciÃ³n recursiva:</w:t>
       </w:r>
     </w:p>
     <w:p>
@@ -1886,7 +1848,7 @@
     </w:p>
     <w:p>
       <w:pPr>
-        <w:spacing w:before="40" w:after="40"/>
+        <w:spacing w:before="20" w:after="20"/>
         <w:ind w:left="454"/>
         <w:shd w:val="clear" w:color="auto" w:fill="F1F5F9"/>
       </w:pPr>
@@ -1901,7 +1863,7 @@
     </w:p>
     <w:p>
       <w:pPr>
-        <w:spacing w:before="40" w:after="40"/>
+        <w:spacing w:before="20" w:after="20"/>
         <w:ind w:left="454"/>
         <w:shd w:val="clear" w:color="auto" w:fill="F1F5F9"/>
       </w:pPr>
@@ -1916,7 +1878,7 @@
     </w:p>
     <w:p>
       <w:pPr>
-        <w:spacing w:before="40" w:after="40"/>
+        <w:spacing w:before="20" w:after="20"/>
         <w:ind w:left="454"/>
         <w:shd w:val="clear" w:color="auto" w:fill="F1F5F9"/>
       </w:pPr>
@@ -1937,7 +1899,7 @@
     </w:p>
     <w:p>
       <w:pPr>
-        <w:spacing w:before="40" w:after="40"/>
+        <w:spacing w:before="20" w:after="20"/>
         <w:ind w:left="454"/>
         <w:shd w:val="clear" w:color="auto" w:fill="F1F5F9"/>
       </w:pPr>
@@ -1947,12 +1909,12 @@
           <w:color w:val="1E40AF"/>
           <w:sz w:val="18"/>
         </w:rPr>
-        <w:t># Intento sin -r (debe fallar con mensaje útil)</w:t>
+        <w:t># Intento sin -r (debe fallar con mensaje Ãºtil)</w:t>
       </w:r>
     </w:p>
     <w:p>
       <w:pPr>
-        <w:spacing w:before="40" w:after="40"/>
+        <w:spacing w:before="20" w:after="20"/>
         <w:ind w:left="454"/>
         <w:shd w:val="clear" w:color="auto" w:fill="F1F5F9"/>
       </w:pPr>
@@ -1983,7 +1945,7 @@
           <w:color w:val="1E3A8A"/>
           <w:sz w:val="21"/>
         </w:rPr>
-        <w:t>"El sistema me protege e incluso me sugiere el comando correcto: `rmdir -r`."</w:t>
+        <w:t>"El sistema me protege e incluso me sugiere el comando correcto: rmdir -r."</w:t>
       </w:r>
     </w:p>
     <w:p>
@@ -1993,7 +1955,7 @@
     </w:p>
     <w:p>
       <w:pPr>
-        <w:spacing w:before="40" w:after="40"/>
+        <w:spacing w:before="20" w:after="20"/>
         <w:ind w:left="454"/>
         <w:shd w:val="clear" w:color="auto" w:fill="F1F5F9"/>
       </w:pPr>
@@ -2003,12 +1965,12 @@
           <w:color w:val="1E40AF"/>
           <w:sz w:val="18"/>
         </w:rPr>
-        <w:t># Eliminación recursiva</w:t>
+        <w:t># EliminaciÃ³n recursiva</w:t>
       </w:r>
     </w:p>
     <w:p>
       <w:pPr>
-        <w:spacing w:before="40" w:after="40"/>
+        <w:spacing w:before="20" w:after="20"/>
         <w:ind w:left="454"/>
         <w:shd w:val="clear" w:color="auto" w:fill="F1F5F9"/>
       </w:pPr>
@@ -2023,7 +1985,7 @@
     </w:p>
     <w:p>
       <w:pPr>
-        <w:spacing w:before="40" w:after="40"/>
+        <w:spacing w:before="20" w:after="20"/>
         <w:ind w:left="454"/>
         <w:shd w:val="clear" w:color="auto" w:fill="F1F5F9"/>
       </w:pPr>
@@ -2054,7 +2016,7 @@
           <w:color w:val="1E3A8A"/>
           <w:sz w:val="21"/>
         </w:rPr>
-        <w:t>"Con la flag `-r` elimina el directorio y todo su contenido en cascada. En este caso 1 archivo fue eliminado junto con el directorio."</w:t>
+        <w:t>"Con la flag -r elimina el directorio y todo su contenido en cascada. En este caso 1 archivo fue eliminado junto con el directorio."</w:t>
       </w:r>
     </w:p>
     <w:p>
@@ -2080,7 +2042,7 @@
         <w:rPr>
           <w:color w:val="6D28D9"/>
         </w:rPr>
-        <w:t>SEGMENTO 5 – TOLERANCIA A FALLOS (2 min)</w:t>
+        <w:t>SEGMENTO 5 â€“ TOLERANCIA A FALLOS (2 min)</w:t>
       </w:r>
     </w:p>
     <w:p>
@@ -2095,7 +2057,7 @@
           <w:color w:val="1E3A8A"/>
           <w:sz w:val="21"/>
         </w:rPr>
-        <w:t>📺 Pantalla: Terminal DataNode 2 + Terminal cliente</w:t>
+        <w:t>ðŸ“º Pantalla: Terminal DataNode 2 + Terminal cliente</w:t>
       </w:r>
     </w:p>
     <w:p>
@@ -2115,7 +2077,7 @@
           <w:color w:val="1E3A8A"/>
           <w:sz w:val="21"/>
         </w:rPr>
-        <w:t>"Y ahora la prueba más importante del proyecto: ¿qué pasa si un DataNode se cae?"</w:t>
+        <w:t>"Y ahora la prueba mÃ¡s importante del proyecto: Â¿quÃ© pasa si un DataNode se cae?"</w:t>
       </w:r>
     </w:p>
     <w:p>
@@ -2130,8 +2092,6 @@
       <w:r>
         <w:rPr>
           <w:b/>
-          <w:i w:val="0"/>
-          <w:color w:val="0F766E"/>
           <w:sz w:val="22"/>
         </w:rPr>
         <w:t>[Ir a terminal del DataNode 2]</w:t>
@@ -2139,7 +2099,7 @@
     </w:p>
     <w:p>
       <w:pPr>
-        <w:spacing w:before="40" w:after="40"/>
+        <w:spacing w:before="20" w:after="20"/>
         <w:ind w:left="454"/>
         <w:shd w:val="clear" w:color="auto" w:fill="F1F5F9"/>
       </w:pPr>
@@ -2165,7 +2125,7 @@
           <w:color w:val="1E3A8A"/>
           <w:sz w:val="21"/>
         </w:rPr>
-        <w:t>"Acabo de detener el DataNode 2. Ya no está disponible."</w:t>
+        <w:t>"Acabo de detener el DataNode 2. Ya no estÃ¡ disponible."</w:t>
       </w:r>
     </w:p>
     <w:p>
@@ -2180,8 +2140,6 @@
       <w:r>
         <w:rPr>
           <w:b/>
-          <w:i w:val="0"/>
-          <w:color w:val="0F766E"/>
           <w:sz w:val="22"/>
         </w:rPr>
         <w:t>[Esperar 5 segundos, ir a logs del NameNode]</w:t>
@@ -2189,7 +2147,7 @@
     </w:p>
     <w:p>
       <w:pPr>
-        <w:spacing w:before="40" w:after="40"/>
+        <w:spacing w:before="20" w:after="20"/>
         <w:ind w:left="454"/>
         <w:shd w:val="clear" w:color="auto" w:fill="F1F5F9"/>
       </w:pPr>
@@ -2215,7 +2173,7 @@
           <w:color w:val="1E3A8A"/>
           <w:sz w:val="21"/>
         </w:rPr>
-        <w:t>"El HeartbeatMonitor detectará en menos de 30 segundos que dn2 dejó de responder y marcará el nodo como inactivo. Vean cómo aparece el mensaje de nodo caído."</w:t>
+        <w:t>"El HeartbeatMonitor detectarÃ¡ en menos de 30 segundos que dn2 dejÃ³ de responder y marcarÃ¡ el nodo como inactivo. Vean cÃ³mo aparece el mensaje de nodo caÃ­do."</w:t>
       </w:r>
     </w:p>
     <w:p>
@@ -2230,8 +2188,6 @@
       <w:r>
         <w:rPr>
           <w:b/>
-          <w:i w:val="0"/>
-          <w:color w:val="0F766E"/>
           <w:sz w:val="22"/>
         </w:rPr>
         <w:t>[Ir a terminal del cliente]</w:t>
@@ -2239,7 +2195,7 @@
     </w:p>
     <w:p>
       <w:pPr>
-        <w:spacing w:before="40" w:after="40"/>
+        <w:spacing w:before="20" w:after="20"/>
         <w:ind w:left="454"/>
         <w:shd w:val="clear" w:color="auto" w:fill="F1F5F9"/>
       </w:pPr>
@@ -2249,7 +2205,7 @@
           <w:color w:val="1E40AF"/>
           <w:sz w:val="18"/>
         </w:rPr>
-        <w:t>python cli.py get /demo/archivo_demo.bin /tmp/archivo_tolerancia.bin</w:t>
+        <w:t>python3 cli.py get /demo/archivo_demo.bin /tmp/archivo_tolerancia.bin</w:t>
       </w:r>
     </w:p>
     <w:p/>
@@ -2265,7 +2221,7 @@
           <w:color w:val="1E3A8A"/>
           <w:sz w:val="21"/>
         </w:rPr>
-        <w:t>"A pesar de que DataNode 2 está caído, el sistema descargó el archivo exitosamente usando las réplicas en dn1 y dn3. El fallback fue completamente automático y transparente para el usuario."</w:t>
+        <w:t>"A pesar de que DataNode 2 estÃ¡ caÃ­do, el sistema descargÃ³ el archivo exitosamente usando las rÃ©plicas en dn1 y dn3. El fallback fue completamente automÃ¡tico y transparente para el usuario."</w:t>
       </w:r>
     </w:p>
     <w:p>
@@ -2275,7 +2231,7 @@
     </w:p>
     <w:p>
       <w:pPr>
-        <w:spacing w:before="40" w:after="40"/>
+        <w:spacing w:before="20" w:after="20"/>
         <w:ind w:left="454"/>
         <w:shd w:val="clear" w:color="auto" w:fill="F1F5F9"/>
       </w:pPr>
@@ -2301,7 +2257,7 @@
           <w:color w:val="1E3A8A"/>
           <w:sz w:val="21"/>
         </w:rPr>
-        <w:t>"SHA-256 idéntico. La tolerancia a fallos funciona perfectamente en producción en AWS."</w:t>
+        <w:t>"SHA-256 idÃ©ntico. La tolerancia a fallos funciona perfectamente en producciÃ³n en AWS."</w:t>
       </w:r>
     </w:p>
     <w:p>
@@ -2327,7 +2283,7 @@
         <w:rPr>
           <w:color w:val="6D28D9"/>
         </w:rPr>
-        <w:t>SEGMENTO 6 – CIERRE (1 min)</w:t>
+        <w:t>SEGMENTO 6 â€“ CIERRE (1 min)</w:t>
       </w:r>
     </w:p>
     <w:p>
@@ -2342,7 +2298,7 @@
           <w:color w:val="1E3A8A"/>
           <w:sz w:val="21"/>
         </w:rPr>
-        <w:t>📺 Pantalla: Cámara frontal + mostrar GitHub brevemente</w:t>
+        <w:t>ðŸ“º Pantalla: CÃ¡mara frontal + mostrar GitHub brevemente</w:t>
       </w:r>
     </w:p>
     <w:p>
@@ -2357,8 +2313,6 @@
       <w:r>
         <w:rPr>
           <w:b/>
-          <w:i w:val="0"/>
-          <w:color w:val="0F766E"/>
           <w:sz w:val="22"/>
         </w:rPr>
         <w:t>[Mostrar el repositorio en GitHub]</w:t>
@@ -2381,7 +2335,7 @@
           <w:color w:val="1E3A8A"/>
           <w:sz w:val="21"/>
         </w:rPr>
-        <w:t>"Para cerrar, todo el código fuente está disponible en GitHub en el repositorio Proyecto-DFS-Sistemas-distribuidos. El proyecto incluye:"</w:t>
+        <w:t>"Para cerrar, todo el cÃ³digo fuente estÃ¡ disponible en GitHub en el repositorio Proyecto-DFS-Sistemas-distribuidos. El proyecto incluye:"</w:t>
       </w:r>
     </w:p>
     <w:p>
@@ -2401,7 +2355,7 @@
           <w:color w:val="1E3A8A"/>
           <w:sz w:val="21"/>
         </w:rPr>
-        <w:t>"• Un NameNode con autenticación JWT, gestión de metadatos en SQLite, y monitoreo activo de nodos."</w:t>
+        <w:t>"â€¢ Un NameNode con autenticaciÃ³n JWT, gestiÃ³n de metadatos en SQLite, y monitoreo activo de nodos."</w:t>
       </w:r>
     </w:p>
     <w:p>
@@ -2416,7 +2370,7 @@
           <w:color w:val="1E3A8A"/>
           <w:sz w:val="21"/>
         </w:rPr>
-        <w:t>"• Tres DataNodes con almacenamiento en disco, verificación SHA-256 y replicación pipeline."</w:t>
+        <w:t>"â€¢ Tres DataNodes con almacenamiento en disco, verificaciÃ³n SHA-256 y replicaciÃ³n pipeline."</w:t>
       </w:r>
     </w:p>
     <w:p>
@@ -2431,7 +2385,7 @@
           <w:color w:val="1E3A8A"/>
           <w:sz w:val="21"/>
         </w:rPr>
-        <w:t>"• Una CLI completa con put, get, ls, mkdir, rmdir y rm."</w:t>
+        <w:t>"â€¢ Una CLI completa con put, get, ls, mkdir, rmdir y rm."</w:t>
       </w:r>
     </w:p>
     <w:p>
@@ -2446,7 +2400,7 @@
           <w:color w:val="1E3A8A"/>
           <w:sz w:val="21"/>
         </w:rPr>
-        <w:t>"• Todo empaquetado en Docker y desplegado en 4 instancias EC2 reales en AWS."</w:t>
+        <w:t>"â€¢ Todo empaquetado en Docker y desplegado en 4 instancias EC2 reales en AWS."</w:t>
       </w:r>
     </w:p>
     <w:p>
@@ -2466,7 +2420,7 @@
           <w:color w:val="1E3A8A"/>
           <w:sz w:val="21"/>
         </w:rPr>
-        <w:t>"Este proyecto me permitió entender en profundidad cómo funcionan sistemas como HDFS y GFS: la separación entre plano de control y plano de datos, la replicación como mecanismo de tolerancia, y el valor de la verificación de integridad en sistemas distribuidos.</w:t>
+        <w:t>"Este proyecto me permitiÃ³ entender en profundidad cÃ³mo funcionan sistemas como HDFS y GFS: la separaciÃ³n entre plano de control y plano de datos, la replicaciÃ³n como mecanismo de tolerancia, y el valor de la verificaciÃ³n de integridad en sistemas distribuidos.</w:t>
       </w:r>
     </w:p>
     <w:p>
@@ -2476,7 +2430,6 @@
       <w:r>
         <w:rPr>
           <w:b w:val="0"/>
-          <w:i w:val="0"/>
           <w:sz w:val="22"/>
         </w:rPr>
         <w:t>&gt;</w:t>
@@ -2520,7 +2473,7 @@
         <w:rPr>
           <w:color w:val="0F766E"/>
         </w:rPr>
-        <w:t>🎥 CONSEJOS DE GRABACIÓN</w:t>
+        <w:t>ðŸŽ¥ CONSEJOS DE GRABACIÃ“N</w:t>
       </w:r>
     </w:p>
     <w:p>
@@ -2583,7 +2536,7 @@
           </w:tcPr>
           <w:p>
             <w:r>
-              <w:t>OBS Studio (gratis) o simplemente la grabación de pantalla de Windows (Win+G)</w:t>
+              <w:t>OBS Studio (gratis) o simplemente la grabaciÃ³n de pantalla de Windows (Win+G)</w:t>
             </w:r>
           </w:p>
         </w:tc>
@@ -2649,7 +2602,7 @@
           </w:tcPr>
           <w:p>
             <w:r>
-              <w:t>Aumenta el tamaño de fuente de la terminal a 16-18pt para que se vea bien</w:t>
+              <w:t>Aumenta el tamaÃ±o de fuente de la terminal a 16-18pt para que se vea bien</w:t>
             </w:r>
           </w:p>
         </w:tc>
@@ -2661,7 +2614,7 @@
           </w:tcPr>
           <w:p>
             <w:r>
-              <w:t>**Pausa con intención**</w:t>
+              <w:t>**Pausa con intenciÃ³n**</w:t>
             </w:r>
           </w:p>
         </w:tc>
@@ -2671,7 +2624,7 @@
           </w:tcPr>
           <w:p>
             <w:r>
-              <w:t>Deja 2-3 segundos después de cada comando para que se vea la salida</w:t>
+              <w:t>Deja 2-3 segundos despuÃ©s de cada comando para que se vea la salida</w:t>
             </w:r>
           </w:p>
         </w:tc>
@@ -2693,7 +2646,7 @@
           </w:tcPr>
           <w:p>
             <w:r>
-              <w:t>Habla un 20% más lento de lo normal — en cámara siempre se percibe más rápido</w:t>
+              <w:t>Habla un 20% mÃ¡s lento de lo normal â€” en cÃ¡mara siempre se percibe mÃ¡s rÃ¡pido</w:t>
             </w:r>
           </w:p>
         </w:tc>
@@ -2715,7 +2668,7 @@
           </w:tcPr>
           <w:p>
             <w:r>
-              <w:t>Una toma continua de 12 min es mejor que muchos cortes — se ve más profesional</w:t>
+              <w:t>Una toma continua de 12 min es mejor que muchos cortes â€” se ve mÃ¡s profesional</w:t>
             </w:r>
           </w:p>
         </w:tc>
@@ -2745,7 +2698,7 @@
         <w:rPr>
           <w:color w:val="0F766E"/>
         </w:rPr>
-        <w:t>⏱️ CRONOGRAMA DE PANTALLAS</w:t>
+        <w:t>â±ï¸ CRONOGRAMA DE PANTALLAS</w:t>
       </w:r>
     </w:p>
     <w:p>
@@ -2755,7 +2708,7 @@
     </w:p>
     <w:p>
       <w:pPr>
-        <w:spacing w:before="40" w:after="40"/>
+        <w:spacing w:before="20" w:after="20"/>
         <w:ind w:left="454"/>
         <w:shd w:val="clear" w:color="auto" w:fill="F1F5F9"/>
       </w:pPr>
@@ -2765,12 +2718,12 @@
           <w:color w:val="1E40AF"/>
           <w:sz w:val="18"/>
         </w:rPr>
-        <w:t>00:00 - 01:00  → Cámara frontal (introducción)</w:t>
+        <w:t>00:00 - 01:00  â†’ CÃ¡mara frontal (introducciÃ³n)</w:t>
       </w:r>
     </w:p>
     <w:p>
       <w:pPr>
-        <w:spacing w:before="40" w:after="40"/>
+        <w:spacing w:before="20" w:after="20"/>
         <w:ind w:left="454"/>
         <w:shd w:val="clear" w:color="auto" w:fill="F1F5F9"/>
       </w:pPr>
@@ -2780,12 +2733,12 @@
           <w:color w:val="1E40AF"/>
           <w:sz w:val="18"/>
         </w:rPr>
-        <w:t>01:00 - 03:00  → README / diagrama de arquitectura</w:t>
+        <w:t>01:00 - 03:00  â†’ README / diagrama de arquitectura</w:t>
       </w:r>
     </w:p>
     <w:p>
       <w:pPr>
-        <w:spacing w:before="40" w:after="40"/>
+        <w:spacing w:before="20" w:after="20"/>
         <w:ind w:left="454"/>
         <w:shd w:val="clear" w:color="auto" w:fill="F1F5F9"/>
       </w:pPr>
@@ -2795,12 +2748,12 @@
           <w:color w:val="1E40AF"/>
           <w:sz w:val="18"/>
         </w:rPr>
-        <w:t>03:00 - 06:00  → VS Code (código: proto, heartbeat, blockstore, cli)</w:t>
+        <w:t>03:00 - 06:00  â†’ VS Code (cÃ³digo: proto, heartbeat, blockstore, cli)</w:t>
       </w:r>
     </w:p>
     <w:p>
       <w:pPr>
-        <w:spacing w:before="40" w:after="40"/>
+        <w:spacing w:before="20" w:after="20"/>
         <w:ind w:left="454"/>
         <w:shd w:val="clear" w:color="auto" w:fill="F1F5F9"/>
       </w:pPr>
@@ -2810,12 +2763,12 @@
           <w:color w:val="1E40AF"/>
           <w:sz w:val="18"/>
         </w:rPr>
-        <w:t>06:00 - 11:00  → Terminales SSH (demo en vivo AWS: put, get, sha256)</w:t>
+        <w:t>06:00 - 11:00  â†’ Terminales SSH (demo en vivo AWS: put, get, sha256)</w:t>
       </w:r>
     </w:p>
     <w:p>
       <w:pPr>
-        <w:spacing w:before="40" w:after="40"/>
+        <w:spacing w:before="20" w:after="20"/>
         <w:ind w:left="454"/>
         <w:shd w:val="clear" w:color="auto" w:fill="F1F5F9"/>
       </w:pPr>
@@ -2825,12 +2778,12 @@
           <w:color w:val="1E40AF"/>
           <w:sz w:val="18"/>
         </w:rPr>
-        <w:t>11:00 - 13:00  → Terminal cliente (status + rmdir -r)</w:t>
+        <w:t>11:00 - 13:00  â†’ Terminal cliente (status + rmdir -r)</w:t>
       </w:r>
     </w:p>
     <w:p>
       <w:pPr>
-        <w:spacing w:before="40" w:after="40"/>
+        <w:spacing w:before="20" w:after="20"/>
         <w:ind w:left="454"/>
         <w:shd w:val="clear" w:color="auto" w:fill="F1F5F9"/>
       </w:pPr>
@@ -2840,12 +2793,12 @@
           <w:color w:val="1E40AF"/>
           <w:sz w:val="18"/>
         </w:rPr>
-        <w:t>13:00 - 15:00  → Terminales SSH (tolerancia a fallos)</w:t>
+        <w:t>13:00 - 15:00  â†’ Terminales SSH (tolerancia a fallos)</w:t>
       </w:r>
     </w:p>
     <w:p>
       <w:pPr>
-        <w:spacing w:before="40" w:after="40"/>
+        <w:spacing w:before="20" w:after="20"/>
         <w:ind w:left="454"/>
         <w:shd w:val="clear" w:color="auto" w:fill="F1F5F9"/>
       </w:pPr>
@@ -2855,7 +2808,7 @@
           <w:color w:val="1E40AF"/>
           <w:sz w:val="18"/>
         </w:rPr>
-        <w:t>15:00 - 16:00  → GitHub + cámara frontal (cierre)</w:t>
+        <w:t>15:00 - 16:00  â†’ GitHub + cÃ¡mara frontal (cierre)</w:t>
       </w:r>
     </w:p>
     <w:p/>

</xml_diff>